<commit_message>
A second build without the experimental berth-request tab
build.mjs writes "Sheets Generator (no berth requests).html" beside the
full page: the same build with the tab, its panel and its module cut out,
stamped with the same version. The page's remembered tab is honoured
only when this copy carries it, since both copies share the browser's
memory. The build test loads the copy in a clean context, the smoke opens
it in Chromium and builds the weekday books from it, CI checks it is in
step with src/, and the guide and README name it.

Co-Authored-By: Claude Fable 5.1 <noreply@anthropic.com>
Claude-Session: https://claude.ai/code/session_01Bo8y3CPA6i1JGS4N3h4DXr
</commit_message>
<xml_diff>
--- a/HOW TO USE.docx
+++ b/HOW TO USE.docx
@@ -173,7 +173,45 @@
           <w:sz w:val="21"/>
           <w:szCs w:val="21"/>
         </w:rPr>
-        <w:t xml:space="preserve"> builds the unit berthing books — the SHEETS — from the paperwork you already produce.</w:t>
+        <w:t xml:space="preserve"> builds the unit berthing books — the SHEETS — from the paperwork you already produce. (</w:t>
+      </w:r>
+      <w:r>
+        <w:rPr>
+          <w:rFonts w:ascii="Consolas" w:cs="Consolas" w:eastAsia="Consolas" w:hAnsi="Consolas"/>
+          <w:color w:val="262E33"/>
+          <w:sz w:val="19"/>
+          <w:szCs w:val="19"/>
+        </w:rPr>
+        <w:t xml:space="preserve">Sheets Generator (no berth requests).html</w:t>
+      </w:r>
+      <w:r>
+        <w:rPr>
+          <w:rFonts w:ascii="Calibri" w:cs="Calibri" w:eastAsia="Calibri" w:hAnsi="Calibri"/>
+          <w:color w:val="262E33"/>
+          <w:sz w:val="21"/>
+          <w:szCs w:val="21"/>
+        </w:rPr>
+        <w:t xml:space="preserve"> is the same page without the experimental </w:t>
+      </w:r>
+      <w:r>
+        <w:rPr>
+          <w:rFonts w:ascii="Calibri" w:cs="Calibri" w:eastAsia="Calibri" w:hAnsi="Calibri"/>
+          <w:i/>
+          <w:iCs/>
+          <w:color w:val="262E33"/>
+          <w:sz w:val="21"/>
+          <w:szCs w:val="21"/>
+        </w:rPr>
+        <w:t xml:space="preserve">Berth requests</w:t>
+      </w:r>
+      <w:r>
+        <w:rPr>
+          <w:rFonts w:ascii="Calibri" w:cs="Calibri" w:eastAsia="Calibri" w:hAnsi="Calibri"/>
+          <w:color w:val="262E33"/>
+          <w:sz w:val="21"/>
+          <w:szCs w:val="21"/>
+        </w:rPr>
+        <w:t xml:space="preserve"> tab, for anyone who does not need it.)</w:t>
       </w:r>
     </w:p>
     <w:p>

</xml_diff>

<commit_message>
Deal reads DEA, the sanding table has a season, variations can be pasted (3.32.0)
Shortages & variations names a station it has no road code for by its
CRS code off the station table (Deal DEA, Dartford DFD - 36 places that
printed ???), never a siding or signal, and the Review names what is
left in full. The 395 sheet takes a Priority sanding table box on the
weekday, weekend and base tabs; unticked, the table, its rules and its
list are left off and nothing else moves. Shortages & variations gets
paste boxes, read by content and holding a full-day Detail.

Co-Authored-By: Claude Opus 5.5 <noreply@anthropic.com>
Claude-Session: https://claude.ai/code/session_01Bo8y3CPA6i1JGS4N3h4DXr
</commit_message>
<xml_diff>
--- a/HOW TO USE.docx
+++ b/HOW TO USE.docx
@@ -8891,6 +8891,31 @@
       <w:r>
         <w:rPr>
           <w:rFonts w:ascii="Calibri" w:cs="Calibri" w:eastAsia="Calibri" w:hAnsi="Calibri"/>
+          <w:b/>
+          <w:bCs/>
+          <w:color w:val="262E33"/>
+          <w:sz w:val="21"/>
+          <w:szCs w:val="21"/>
+        </w:rPr>
+        <w:t xml:space="preserve">Priority sanding table (High Speed).</w:t>
+      </w:r>
+      <w:r>
+        <w:rPr>
+          <w:rFonts w:ascii="Calibri" w:cs="Calibri" w:eastAsia="Calibri" w:hAnsi="Calibri"/>
+          <w:color w:val="262E33"/>
+          <w:sz w:val="21"/>
+          <w:szCs w:val="21"/>
+        </w:rPr>
+        <w:t xml:space="preserve"> The PRIORITY SANDING table on the 395 sheet. Sanding runs from the autumn to about Christmas: untick this for the rest of the year and the sheet is written without the table — nothing else on it moves. Tick it again when sanding starts. It is remembered like the others.</w:t>
+      </w:r>
+    </w:p>
+    <w:p>
+      <w:pPr>
+        <w:spacing w:after="140" w:line="276" w:lineRule="auto"/>
+      </w:pPr>
+      <w:r>
+        <w:rPr>
+          <w:rFonts w:ascii="Calibri" w:cs="Calibri" w:eastAsia="Calibri" w:hAnsi="Calibri"/>
           <w:color w:val="262E33"/>
           <w:sz w:val="21"/>
           <w:szCs w:val="21"/>
@@ -9015,7 +9040,27 @@
           <w:sz w:val="21"/>
           <w:szCs w:val="21"/>
         </w:rPr>
-        <w:t xml:space="preserve">. Ticking a book puts a headcode on every line of it and rebuilds it.</w:t>
+        <w:t xml:space="preserve"> — and the same </w:t>
+      </w:r>
+      <w:r>
+        <w:rPr>
+          <w:rFonts w:ascii="Calibri" w:cs="Calibri" w:eastAsia="Calibri" w:hAnsi="Calibri"/>
+          <w:b/>
+          <w:bCs/>
+          <w:color w:val="262E33"/>
+          <w:sz w:val="21"/>
+          <w:szCs w:val="21"/>
+        </w:rPr>
+        <w:t xml:space="preserve">Priority sanding table</w:t>
+      </w:r>
+      <w:r>
+        <w:rPr>
+          <w:rFonts w:ascii="Calibri" w:cs="Calibri" w:eastAsia="Calibri" w:hAnsi="Calibri"/>
+          <w:color w:val="262E33"/>
+          <w:sz w:val="21"/>
+          <w:szCs w:val="21"/>
+        </w:rPr>
+        <w:t xml:space="preserve"> box. Ticking a book puts a headcode on every line of it and rebuilds it.</w:t>
       </w:r>
     </w:p>
     <w:p>
@@ -10433,6 +10478,171 @@
       <w:r>
         <w:rPr>
           <w:rFonts w:ascii="Calibri" w:cs="Calibri" w:eastAsia="Calibri" w:hAnsi="Calibri"/>
+          <w:b/>
+          <w:bCs/>
+          <w:color w:val="262E33"/>
+          <w:sz w:val="21"/>
+          <w:szCs w:val="21"/>
+        </w:rPr>
+        <w:t xml:space="preserve">Pasting instead.</w:t>
+      </w:r>
+      <w:r>
+        <w:rPr>
+          <w:rFonts w:ascii="Calibri" w:cs="Calibri" w:eastAsia="Calibri" w:hAnsi="Calibri"/>
+          <w:color w:val="262E33"/>
+          <w:sz w:val="21"/>
+          <w:szCs w:val="21"/>
+        </w:rPr>
+        <w:t xml:space="preserve"> On a machine that will not let you save the files, click </w:t>
+      </w:r>
+      <w:r>
+        <w:rPr>
+          <w:rFonts w:ascii="Calibri" w:cs="Calibri" w:eastAsia="Calibri" w:hAnsi="Calibri"/>
+          <w:b/>
+          <w:bCs/>
+          <w:color w:val="262E33"/>
+          <w:sz w:val="21"/>
+          <w:szCs w:val="21"/>
+        </w:rPr>
+        <w:t xml:space="preserve">Can't get the files onto this machine? Paste the reports instead</w:t>
+      </w:r>
+      <w:r>
+        <w:rPr>
+          <w:rFonts w:ascii="Calibri" w:cs="Calibri" w:eastAsia="Calibri" w:hAnsi="Calibri"/>
+          <w:color w:val="262E33"/>
+          <w:sz w:val="21"/>
+          <w:szCs w:val="21"/>
+        </w:rPr>
+        <w:t xml:space="preserve"> under the drop zone. Open each report's CSV in Notepad or Excel, press </w:t>
+      </w:r>
+      <w:r>
+        <w:rPr>
+          <w:rFonts w:ascii="Calibri" w:cs="Calibri" w:eastAsia="Calibri" w:hAnsi="Calibri"/>
+          <w:b/>
+          <w:bCs/>
+          <w:color w:val="262E33"/>
+          <w:sz w:val="21"/>
+          <w:szCs w:val="21"/>
+        </w:rPr>
+        <w:t xml:space="preserve">Ctrl+A</w:t>
+      </w:r>
+      <w:r>
+        <w:rPr>
+          <w:rFonts w:ascii="Calibri" w:cs="Calibri" w:eastAsia="Calibri" w:hAnsi="Calibri"/>
+          <w:color w:val="262E33"/>
+          <w:sz w:val="21"/>
+          <w:szCs w:val="21"/>
+        </w:rPr>
+        <w:t xml:space="preserve"> then </w:t>
+      </w:r>
+      <w:r>
+        <w:rPr>
+          <w:rFonts w:ascii="Calibri" w:cs="Calibri" w:eastAsia="Calibri" w:hAnsi="Calibri"/>
+          <w:b/>
+          <w:bCs/>
+          <w:color w:val="262E33"/>
+          <w:sz w:val="21"/>
+          <w:szCs w:val="21"/>
+        </w:rPr>
+        <w:t xml:space="preserve">Ctrl+C</w:t>
+      </w:r>
+      <w:r>
+        <w:rPr>
+          <w:rFonts w:ascii="Calibri" w:cs="Calibri" w:eastAsia="Calibri" w:hAnsi="Calibri"/>
+          <w:color w:val="262E33"/>
+          <w:sz w:val="21"/>
+          <w:szCs w:val="21"/>
+        </w:rPr>
+        <w:t xml:space="preserve">, and paste it into a box — </w:t>
+      </w:r>
+      <w:r>
+        <w:rPr>
+          <w:rFonts w:ascii="Calibri" w:cs="Calibri" w:eastAsia="Calibri" w:hAnsi="Calibri"/>
+          <w:b/>
+          <w:bCs/>
+          <w:color w:val="262E33"/>
+          <w:sz w:val="21"/>
+          <w:szCs w:val="21"/>
+        </w:rPr>
+        <w:t xml:space="preserve">Operating Report</w:t>
+      </w:r>
+      <w:r>
+        <w:rPr>
+          <w:rFonts w:ascii="Calibri" w:cs="Calibri" w:eastAsia="Calibri" w:hAnsi="Calibri"/>
+          <w:color w:val="262E33"/>
+          <w:sz w:val="21"/>
+          <w:szCs w:val="21"/>
+        </w:rPr>
+        <w:t xml:space="preserve">, </w:t>
+      </w:r>
+      <w:r>
+        <w:rPr>
+          <w:rFonts w:ascii="Calibri" w:cs="Calibri" w:eastAsia="Calibri" w:hAnsi="Calibri"/>
+          <w:b/>
+          <w:bCs/>
+          <w:color w:val="262E33"/>
+          <w:sz w:val="21"/>
+          <w:szCs w:val="21"/>
+        </w:rPr>
+        <w:t xml:space="preserve">Diagram Detail</w:t>
+      </w:r>
+      <w:r>
+        <w:rPr>
+          <w:rFonts w:ascii="Calibri" w:cs="Calibri" w:eastAsia="Calibri" w:hAnsi="Calibri"/>
+          <w:color w:val="262E33"/>
+          <w:sz w:val="21"/>
+          <w:szCs w:val="21"/>
+        </w:rPr>
+        <w:t xml:space="preserve">, and </w:t>
+      </w:r>
+      <w:r>
+        <w:rPr>
+          <w:rFonts w:ascii="Calibri" w:cs="Calibri" w:eastAsia="Calibri" w:hAnsi="Calibri"/>
+          <w:b/>
+          <w:bCs/>
+          <w:color w:val="262E33"/>
+          <w:sz w:val="21"/>
+          <w:szCs w:val="21"/>
+        </w:rPr>
+        <w:t xml:space="preserve">Diagram Summary</w:t>
+      </w:r>
+      <w:r>
+        <w:rPr>
+          <w:rFonts w:ascii="Calibri" w:cs="Calibri" w:eastAsia="Calibri" w:hAnsi="Calibri"/>
+          <w:color w:val="262E33"/>
+          <w:sz w:val="21"/>
+          <w:szCs w:val="21"/>
+        </w:rPr>
+        <w:t xml:space="preserve"> if you have it — then click </w:t>
+      </w:r>
+      <w:r>
+        <w:rPr>
+          <w:rFonts w:ascii="Calibri" w:cs="Calibri" w:eastAsia="Calibri" w:hAnsi="Calibri"/>
+          <w:b/>
+          <w:bCs/>
+          <w:color w:val="262E33"/>
+          <w:sz w:val="21"/>
+          <w:szCs w:val="21"/>
+        </w:rPr>
+        <w:t xml:space="preserve">Read the pasted reports</w:t>
+      </w:r>
+      <w:r>
+        <w:rPr>
+          <w:rFonts w:ascii="Calibri" w:cs="Calibri" w:eastAsia="Calibri" w:hAnsi="Calibri"/>
+          <w:color w:val="262E33"/>
+          <w:sz w:val="21"/>
+          <w:szCs w:val="21"/>
+        </w:rPr>
+        <w:t xml:space="preserve">. Each box is read by what is in it, so a report in the wrong box is still read right. A Diagram Detail the size of a whole day is held rather than shown, the same as on the weekday tab. PDFs cannot be pasted.</w:t>
+      </w:r>
+    </w:p>
+    <w:p>
+      <w:pPr>
+        <w:spacing w:after="140" w:line="276" w:lineRule="auto"/>
+      </w:pPr>
+      <w:r>
+        <w:rPr>
+          <w:rFonts w:ascii="Calibri" w:cs="Calibri" w:eastAsia="Calibri" w:hAnsi="Calibri"/>
           <w:color w:val="262E33"/>
           <w:sz w:val="21"/>
           <w:szCs w:val="21"/>
@@ -10849,7 +11059,61 @@
           <w:sz w:val="21"/>
           <w:szCs w:val="21"/>
         </w:rPr>
-        <w:t xml:space="preserve"> — not the berthing books' station codes, because a discrepancy is worked off a road. </w:t>
+        <w:t xml:space="preserve"> — not the berthing books' station codes, because a discrepancy is worked off a road. A plain station is named by its three-letter code — Deal is </w:t>
+      </w:r>
+      <w:r>
+        <w:rPr>
+          <w:rFonts w:ascii="Consolas" w:cs="Consolas" w:eastAsia="Consolas" w:hAnsi="Consolas"/>
+          <w:color w:val="262E33"/>
+          <w:sz w:val="19"/>
+          <w:szCs w:val="19"/>
+        </w:rPr>
+        <w:t xml:space="preserve">DEA</w:t>
+      </w:r>
+      <w:r>
+        <w:rPr>
+          <w:rFonts w:ascii="Calibri" w:cs="Calibri" w:eastAsia="Calibri" w:hAnsi="Calibri"/>
+          <w:color w:val="262E33"/>
+          <w:sz w:val="21"/>
+          <w:szCs w:val="21"/>
+        </w:rPr>
+        <w:t xml:space="preserve">, Dartford </w:t>
+      </w:r>
+      <w:r>
+        <w:rPr>
+          <w:rFonts w:ascii="Consolas" w:cs="Consolas" w:eastAsia="Consolas" w:hAnsi="Consolas"/>
+          <w:color w:val="262E33"/>
+          <w:sz w:val="19"/>
+          <w:szCs w:val="19"/>
+        </w:rPr>
+        <w:t xml:space="preserve">DFD</w:t>
+      </w:r>
+      <w:r>
+        <w:rPr>
+          <w:rFonts w:ascii="Calibri" w:cs="Calibri" w:eastAsia="Calibri" w:hAnsi="Calibri"/>
+          <w:color w:val="262E33"/>
+          <w:sz w:val="21"/>
+          <w:szCs w:val="21"/>
+        </w:rPr>
+        <w:t xml:space="preserve">. A siding or signal the list has no code for shows as </w:t>
+      </w:r>
+      <w:r>
+        <w:rPr>
+          <w:rFonts w:ascii="Consolas" w:cs="Consolas" w:eastAsia="Consolas" w:hAnsi="Consolas"/>
+          <w:color w:val="262E33"/>
+          <w:sz w:val="19"/>
+          <w:szCs w:val="19"/>
+        </w:rPr>
+        <w:t xml:space="preserve">???</w:t>
+      </w:r>
+      <w:r>
+        <w:rPr>
+          <w:rFonts w:ascii="Calibri" w:cs="Calibri" w:eastAsia="Calibri" w:hAnsi="Calibri"/>
+          <w:color w:val="262E33"/>
+          <w:sz w:val="21"/>
+          <w:szCs w:val="21"/>
+        </w:rPr>
+        <w:t xml:space="preserve">, and the Review list names it in full so the code can be added. </w:t>
       </w:r>
       <w:r>
         <w:rPr>

</xml_diff>

<commit_message>
Guide: the Cannon Street rounders, and the new messages
The weekend and base sections say a unit starting on a rounder is listed
on its first departure (and that an older copy showing the turn-round
train is out of date). The trouble table gains the refusal that now stays
on half a weekday pair, a spreadsheet on the prints tabs, an empty
Diagram Detail on Shortages & variations, and ??? on the variations list.
HOW TO USE.docx rebuilt from it.

Co-Authored-By: Claude Opus 5.5 <noreply@anthropic.com>
Claude-Session: https://claude.ai/code/session_01Bo8y3CPA6i1JGS4N3h4DXr
</commit_message>
<xml_diff>
--- a/HOW TO USE.docx
+++ b/HOW TO USE.docx
@@ -4661,6 +4661,31 @@
     </w:p>
     <w:p>
       <w:pPr>
+        <w:spacing w:after="140" w:line="276" w:lineRule="auto"/>
+      </w:pPr>
+      <w:r>
+        <w:rPr>
+          <w:rFonts w:ascii="Calibri" w:cs="Calibri" w:eastAsia="Calibri" w:hAnsi="Calibri"/>
+          <w:b/>
+          <w:bCs/>
+          <w:color w:val="262E33"/>
+          <w:sz w:val="21"/>
+          <w:szCs w:val="21"/>
+        </w:rPr>
+        <w:t xml:space="preserve">Cannon Street rounders.</w:t>
+      </w:r>
+      <w:r>
+        <w:rPr>
+          <w:rFonts w:ascii="Calibri" w:cs="Calibri" w:eastAsia="Calibri" w:hAnsi="Calibri"/>
+          <w:color w:val="262E33"/>
+          <w:sz w:val="21"/>
+          <w:szCs w:val="21"/>
+        </w:rPr>
+        <w:t xml:space="preserve"> A unit that starts the day on a rounder — a 2T or 2P out of Cannon Street and back to Cannon Street — is listed on that first departure: SG701 and SG702 on the 2T59 06 15, SG403 and SG404 on the 2P11 06 26. The prints list nothing a rounder does on the way round, so an older copy of the page listed the train the unit turns round onto when it gets back (the 2L15 08 02) in its place. If you see that, you have an old copy: use this one.</w:t>
+      </w:r>
+    </w:p>
+    <w:p>
+      <w:pPr>
         <w:pStyle w:val="Heading2"/>
         <w:keepNext/>
         <w:spacing w:after="90" w:before="280"/>
@@ -5372,6 +5397,20 @@
           <w:szCs w:val="21"/>
         </w:rPr>
         <w:t xml:space="preserve">.</w:t>
+      </w:r>
+    </w:p>
+    <w:p>
+      <w:pPr>
+        <w:spacing w:after="140" w:line="276" w:lineRule="auto"/>
+      </w:pPr>
+      <w:r>
+        <w:rPr>
+          <w:rFonts w:ascii="Calibri" w:cs="Calibri" w:eastAsia="Calibri" w:hAnsi="Calibri"/>
+          <w:color w:val="262E33"/>
+          <w:sz w:val="21"/>
+          <w:szCs w:val="21"/>
+        </w:rPr>
+        <w:t xml:space="preserve">Cannon Street rounders are listed on their first departure here too, the same as on the weekend.</w:t>
       </w:r>
     </w:p>
     <w:p>
@@ -12412,22 +12451,33 @@
             <w:r>
               <w:rPr>
                 <w:rFonts w:ascii="Calibri" w:cs="Calibri" w:eastAsia="Calibri" w:hAnsi="Calibri"/>
-                <w:color w:val="262E33"/>
-                <w:sz w:val="21"/>
-                <w:szCs w:val="21"/>
-              </w:rPr>
-              <w:t xml:space="preserve">A card says </w:t>
-            </w:r>
-            <w:r>
-              <w:rPr>
-                <w:rFonts w:ascii="Calibri" w:cs="Calibri" w:eastAsia="Calibri" w:hAnsi="Calibri"/>
                 <w:i/>
                 <w:iCs/>
                 <w:color w:val="262E33"/>
                 <w:sz w:val="21"/>
                 <w:szCs w:val="21"/>
               </w:rPr>
-              <w:t xml:space="preserve">"No … diagrams in these reports — nothing to build."</w:t>
+              <w:t xml:space="preserve">"“…” isn't a report this reads — …"</w:t>
+            </w:r>
+            <w:r>
+              <w:rPr>
+                <w:rFonts w:ascii="Calibri" w:cs="Calibri" w:eastAsia="Calibri" w:hAnsi="Calibri"/>
+                <w:color w:val="262E33"/>
+                <w:sz w:val="21"/>
+                <w:szCs w:val="21"/>
+              </w:rPr>
+              <w:t xml:space="preserve"> followed by </w:t>
+            </w:r>
+            <w:r>
+              <w:rPr>
+                <w:rFonts w:ascii="Calibri" w:cs="Calibri" w:eastAsia="Calibri" w:hAnsi="Calibri"/>
+                <w:i/>
+                <w:iCs/>
+                <w:color w:val="262E33"/>
+                <w:sz w:val="21"/>
+                <w:szCs w:val="21"/>
+              </w:rPr>
+              <w:t xml:space="preserve">"Genius Summary loaded ✓ — now drop the Diagram Detail report."</w:t>
             </w:r>
           </w:p>
         </w:tc>
@@ -12452,7 +12502,7 @@
                 <w:sz w:val="21"/>
                 <w:szCs w:val="21"/>
               </w:rPr>
-              <w:t xml:space="preserve">No diagrams for that fleet are in the paperwork. Nothing wrong — but in Genius, check a Control Cycle exists for that fleet.</w:t>
+              <w:t xml:space="preserve">The file you just dropped is not one of the two reports, and was left out. The half you had already dropped is kept: drop the other report.</w:t>
             </w:r>
           </w:p>
         </w:tc>
@@ -12475,11 +12525,13 @@
             <w:r>
               <w:rPr>
                 <w:rFonts w:ascii="Calibri" w:cs="Calibri" w:eastAsia="Calibri" w:hAnsi="Calibri"/>
-                <w:color w:val="262E33"/>
-                <w:sz w:val="21"/>
-                <w:szCs w:val="21"/>
-              </w:rPr>
-              <w:t xml:space="preserve">The High Speed sheet's arrivals side is empty</w:t>
+                <w:i/>
+                <w:iCs/>
+                <w:color w:val="262E33"/>
+                <w:sz w:val="21"/>
+                <w:szCs w:val="21"/>
+              </w:rPr>
+              <w:t xml:space="preserve">"“…” is a spreadsheet — this tab doesn’t read spreadsheets. …"</w:t>
             </w:r>
           </w:p>
         </w:tc>
@@ -12504,7 +12556,7 @@
                 <w:sz w:val="21"/>
                 <w:szCs w:val="21"/>
               </w:rPr>
-              <w:t xml:space="preserve">The day before's Summary and Detail were not dropped. Add them and the books are built again with the arrivals.</w:t>
+              <w:t xml:space="preserve">An Excel file was dropped on the Weekend or Base diagrams tab. Drop the diagram prints Word document, or a text or CSV save of it.</w:t>
             </w:r>
           </w:p>
         </w:tc>
@@ -12527,22 +12579,22 @@
             <w:r>
               <w:rPr>
                 <w:rFonts w:ascii="Calibri" w:cs="Calibri" w:eastAsia="Calibri" w:hAnsi="Calibri"/>
+                <w:color w:val="262E33"/>
+                <w:sz w:val="21"/>
+                <w:szCs w:val="21"/>
+              </w:rPr>
+              <w:t xml:space="preserve">A card says </w:t>
+            </w:r>
+            <w:r>
+              <w:rPr>
+                <w:rFonts w:ascii="Calibri" w:cs="Calibri" w:eastAsia="Calibri" w:hAnsi="Calibri"/>
                 <w:i/>
                 <w:iCs/>
                 <w:color w:val="262E33"/>
                 <w:sz w:val="21"/>
                 <w:szCs w:val="21"/>
               </w:rPr>
-              <w:t xml:space="preserve">"This Diagram Summary was exported without “Show diagram sections” ticked …"</w:t>
-            </w:r>
-            <w:r>
-              <w:rPr>
-                <w:rFonts w:ascii="Calibri" w:cs="Calibri" w:eastAsia="Calibri" w:hAnsi="Calibri"/>
-                <w:color w:val="262E33"/>
-                <w:sz w:val="21"/>
-                <w:szCs w:val="21"/>
-              </w:rPr>
-              <w:t xml:space="preserve"> on the Review tab</w:t>
+              <w:t xml:space="preserve">"No … diagrams in these reports — nothing to build."</w:t>
             </w:r>
           </w:p>
         </w:tc>
@@ -12567,7 +12619,7 @@
                 <w:sz w:val="21"/>
                 <w:szCs w:val="21"/>
               </w:rPr>
-              <w:t xml:space="preserve">The Genius setting was off. The books are built, but afternoon formations may be the wrong way round and this export cannot say which. Re-export with it ticked, or put them right with Reverse.</w:t>
+              <w:t xml:space="preserve">No diagrams for that fleet are in the paperwork. Nothing wrong — but in Genius, check a Control Cycle exists for that fleet.</w:t>
             </w:r>
           </w:p>
         </w:tc>
@@ -12594,7 +12646,7 @@
                 <w:sz w:val="21"/>
                 <w:szCs w:val="21"/>
               </w:rPr>
-              <w:t xml:space="preserve">Two units are the wrong way round</w:t>
+              <w:t xml:space="preserve">The High Speed sheet's arrivals side is empty</w:t>
             </w:r>
           </w:p>
         </w:tc>
@@ -12619,47 +12671,7 @@
                 <w:sz w:val="21"/>
                 <w:szCs w:val="21"/>
               </w:rPr>
-              <w:t xml:space="preserve">Look for the note above first. Otherwise, if the entry is under </w:t>
-            </w:r>
-            <w:r>
-              <w:rPr>
-                <w:rFonts w:ascii="Calibri" w:cs="Calibri" w:eastAsia="Calibri" w:hAnsi="Calibri"/>
-                <w:i/>
-                <w:iCs/>
-                <w:color w:val="262E33"/>
-                <w:sz w:val="21"/>
-                <w:szCs w:val="21"/>
-              </w:rPr>
-              <w:t xml:space="preserve">Order to check</w:t>
-            </w:r>
-            <w:r>
-              <w:rPr>
-                <w:rFonts w:ascii="Calibri" w:cs="Calibri" w:eastAsia="Calibri" w:hAnsi="Calibri"/>
-                <w:color w:val="262E33"/>
-                <w:sz w:val="21"/>
-                <w:szCs w:val="21"/>
-              </w:rPr>
-              <w:t xml:space="preserve">, the reports could not settle it; if it is not, the order came from the tables. Either way, press </w:t>
-            </w:r>
-            <w:r>
-              <w:rPr>
-                <w:rFonts w:ascii="Calibri" w:cs="Calibri" w:eastAsia="Calibri" w:hAnsi="Calibri"/>
-                <w:b/>
-                <w:bCs/>
-                <w:color w:val="262E33"/>
-                <w:sz w:val="21"/>
-                <w:szCs w:val="21"/>
-              </w:rPr>
-              <w:t xml:space="preserve">Reverse</w:t>
-            </w:r>
-            <w:r>
-              <w:rPr>
-                <w:rFonts w:ascii="Calibri" w:cs="Calibri" w:eastAsia="Calibri" w:hAnsi="Calibri"/>
-                <w:color w:val="262E33"/>
-                <w:sz w:val="21"/>
-                <w:szCs w:val="21"/>
-              </w:rPr>
-              <w:t xml:space="preserve"> on the Unit order tab and tell us.</w:t>
+              <w:t xml:space="preserve">The day before's Summary and Detail were not dropped. Add them and the books are built again with the arrivals.</w:t>
             </w:r>
           </w:p>
         </w:tc>
@@ -12682,11 +12694,22 @@
             <w:r>
               <w:rPr>
                 <w:rFonts w:ascii="Calibri" w:cs="Calibri" w:eastAsia="Calibri" w:hAnsi="Calibri"/>
-                <w:color w:val="262E33"/>
-                <w:sz w:val="21"/>
-                <w:szCs w:val="21"/>
-              </w:rPr>
-              <w:t xml:space="preserve">A location has its own heading</w:t>
+                <w:i/>
+                <w:iCs/>
+                <w:color w:val="262E33"/>
+                <w:sz w:val="21"/>
+                <w:szCs w:val="21"/>
+              </w:rPr>
+              <w:t xml:space="preserve">"This Diagram Summary was exported without “Show diagram sections” ticked …"</w:t>
+            </w:r>
+            <w:r>
+              <w:rPr>
+                <w:rFonts w:ascii="Calibri" w:cs="Calibri" w:eastAsia="Calibri" w:hAnsi="Calibri"/>
+                <w:color w:val="262E33"/>
+                <w:sz w:val="21"/>
+                <w:szCs w:val="21"/>
+              </w:rPr>
+              <w:t xml:space="preserve"> on the Review tab</w:t>
             </w:r>
           </w:p>
         </w:tc>
@@ -12711,27 +12734,7 @@
                 <w:sz w:val="21"/>
                 <w:szCs w:val="21"/>
               </w:rPr>
-              <w:t xml:space="preserve">A unit berthed somewhere the section list has never heard of. It is under </w:t>
-            </w:r>
-            <w:r>
-              <w:rPr>
-                <w:rFonts w:ascii="Calibri" w:cs="Calibri" w:eastAsia="Calibri" w:hAnsi="Calibri"/>
-                <w:i/>
-                <w:iCs/>
-                <w:color w:val="262E33"/>
-                <w:sz w:val="21"/>
-                <w:szCs w:val="21"/>
-              </w:rPr>
-              <w:t xml:space="preserve">Locations and codes</w:t>
-            </w:r>
-            <w:r>
-              <w:rPr>
-                <w:rFonts w:ascii="Calibri" w:cs="Calibri" w:eastAsia="Calibri" w:hAnsi="Calibri"/>
-                <w:color w:val="262E33"/>
-                <w:sz w:val="21"/>
-                <w:szCs w:val="21"/>
-              </w:rPr>
-              <w:t xml:space="preserve"> — check where it should live.</w:t>
+              <w:t xml:space="preserve">The Genius setting was off. The books are built, but afternoon formations may be the wrong way round and this export cannot say which. Re-export with it ticked, or put them right with Reverse.</w:t>
             </w:r>
           </w:p>
         </w:tc>
@@ -12758,7 +12761,7 @@
                 <w:sz w:val="21"/>
                 <w:szCs w:val="21"/>
               </w:rPr>
-              <w:t xml:space="preserve">A train seems to be missing</w:t>
+              <w:t xml:space="preserve">Two units are the wrong way round</w:t>
             </w:r>
           </w:p>
         </w:tc>
@@ -12783,7 +12786,7 @@
                 <w:sz w:val="21"/>
                 <w:szCs w:val="21"/>
               </w:rPr>
-              <w:t xml:space="preserve">Read </w:t>
+              <w:t xml:space="preserve">Look for the note above first. Otherwise, if the entry is under </w:t>
             </w:r>
             <w:r>
               <w:rPr>
@@ -12794,16 +12797,36 @@
                 <w:sz w:val="21"/>
                 <w:szCs w:val="21"/>
               </w:rPr>
-              <w:t xml:space="preserve">Left off the sheet</w:t>
-            </w:r>
-            <w:r>
-              <w:rPr>
-                <w:rFonts w:ascii="Calibri" w:cs="Calibri" w:eastAsia="Calibri" w:hAnsi="Calibri"/>
-                <w:color w:val="262E33"/>
-                <w:sz w:val="21"/>
-                <w:szCs w:val="21"/>
-              </w:rPr>
-              <w:t xml:space="preserve"> first. If it is not there, note the diagram number and report it.</w:t>
+              <w:t xml:space="preserve">Order to check</w:t>
+            </w:r>
+            <w:r>
+              <w:rPr>
+                <w:rFonts w:ascii="Calibri" w:cs="Calibri" w:eastAsia="Calibri" w:hAnsi="Calibri"/>
+                <w:color w:val="262E33"/>
+                <w:sz w:val="21"/>
+                <w:szCs w:val="21"/>
+              </w:rPr>
+              <w:t xml:space="preserve">, the reports could not settle it; if it is not, the order came from the tables. Either way, press </w:t>
+            </w:r>
+            <w:r>
+              <w:rPr>
+                <w:rFonts w:ascii="Calibri" w:cs="Calibri" w:eastAsia="Calibri" w:hAnsi="Calibri"/>
+                <w:b/>
+                <w:bCs/>
+                <w:color w:val="262E33"/>
+                <w:sz w:val="21"/>
+                <w:szCs w:val="21"/>
+              </w:rPr>
+              <w:t xml:space="preserve">Reverse</w:t>
+            </w:r>
+            <w:r>
+              <w:rPr>
+                <w:rFonts w:ascii="Calibri" w:cs="Calibri" w:eastAsia="Calibri" w:hAnsi="Calibri"/>
+                <w:color w:val="262E33"/>
+                <w:sz w:val="21"/>
+                <w:szCs w:val="21"/>
+              </w:rPr>
+              <w:t xml:space="preserve"> on the Unit order tab and tell us.</w:t>
             </w:r>
           </w:p>
         </w:tc>
@@ -12826,13 +12849,11 @@
             <w:r>
               <w:rPr>
                 <w:rFonts w:ascii="Calibri" w:cs="Calibri" w:eastAsia="Calibri" w:hAnsi="Calibri"/>
-                <w:i/>
-                <w:iCs/>
-                <w:color w:val="262E33"/>
-                <w:sz w:val="21"/>
-                <w:szCs w:val="21"/>
-              </w:rPr>
-              <w:t xml:space="preserve">"That file is damaged or isn't a Word document. Try re-saving the prints from Word as .docx."</w:t>
+                <w:color w:val="262E33"/>
+                <w:sz w:val="21"/>
+                <w:szCs w:val="21"/>
+              </w:rPr>
+              <w:t xml:space="preserve">A location has its own heading</w:t>
             </w:r>
           </w:p>
         </w:tc>
@@ -12857,7 +12878,27 @@
                 <w:sz w:val="21"/>
                 <w:szCs w:val="21"/>
               </w:rPr>
-              <w:t xml:space="preserve">Open the prints in Word, save as .docx, drop the new file.</w:t>
+              <w:t xml:space="preserve">A unit berthed somewhere the section list has never heard of. It is under </w:t>
+            </w:r>
+            <w:r>
+              <w:rPr>
+                <w:rFonts w:ascii="Calibri" w:cs="Calibri" w:eastAsia="Calibri" w:hAnsi="Calibri"/>
+                <w:i/>
+                <w:iCs/>
+                <w:color w:val="262E33"/>
+                <w:sz w:val="21"/>
+                <w:szCs w:val="21"/>
+              </w:rPr>
+              <w:t xml:space="preserve">Locations and codes</w:t>
+            </w:r>
+            <w:r>
+              <w:rPr>
+                <w:rFonts w:ascii="Calibri" w:cs="Calibri" w:eastAsia="Calibri" w:hAnsi="Calibri"/>
+                <w:color w:val="262E33"/>
+                <w:sz w:val="21"/>
+                <w:szCs w:val="21"/>
+              </w:rPr>
+              <w:t xml:space="preserve"> — check where it should live.</w:t>
             </w:r>
           </w:p>
         </w:tc>
@@ -12880,13 +12921,11 @@
             <w:r>
               <w:rPr>
                 <w:rFonts w:ascii="Calibri" w:cs="Calibri" w:eastAsia="Calibri" w:hAnsi="Calibri"/>
-                <w:i/>
-                <w:iCs/>
-                <w:color w:val="262E33"/>
-                <w:sz w:val="21"/>
-                <w:szCs w:val="21"/>
-              </w:rPr>
-              <w:t xml:space="preserve">"That isn't the diagram prints. …"</w:t>
+                <w:color w:val="262E33"/>
+                <w:sz w:val="21"/>
+                <w:szCs w:val="21"/>
+              </w:rPr>
+              <w:t xml:space="preserve">A train seems to be missing</w:t>
             </w:r>
           </w:p>
         </w:tc>
@@ -12911,7 +12950,27 @@
                 <w:sz w:val="21"/>
                 <w:szCs w:val="21"/>
               </w:rPr>
-              <w:t xml:space="preserve">A text or CSV save whose columns were lost. Save it again, or paste it from Word.</w:t>
+              <w:t xml:space="preserve">Read </w:t>
+            </w:r>
+            <w:r>
+              <w:rPr>
+                <w:rFonts w:ascii="Calibri" w:cs="Calibri" w:eastAsia="Calibri" w:hAnsi="Calibri"/>
+                <w:i/>
+                <w:iCs/>
+                <w:color w:val="262E33"/>
+                <w:sz w:val="21"/>
+                <w:szCs w:val="21"/>
+              </w:rPr>
+              <w:t xml:space="preserve">Left off the sheet</w:t>
+            </w:r>
+            <w:r>
+              <w:rPr>
+                <w:rFonts w:ascii="Calibri" w:cs="Calibri" w:eastAsia="Calibri" w:hAnsi="Calibri"/>
+                <w:color w:val="262E33"/>
+                <w:sz w:val="21"/>
+                <w:szCs w:val="21"/>
+              </w:rPr>
+              <w:t xml:space="preserve"> first. If it is not there, note the diagram number and report it.</w:t>
             </w:r>
           </w:p>
         </w:tc>
@@ -12940,7 +12999,7 @@
                 <w:sz w:val="21"/>
                 <w:szCs w:val="21"/>
               </w:rPr>
-              <w:t xml:space="preserve">"That looks like a reissue on its own — …"</w:t>
+              <w:t xml:space="preserve">"That file is damaged or isn't a Word document. Try re-saving the prints from Word as .docx."</w:t>
             </w:r>
           </w:p>
         </w:tc>
@@ -12965,7 +13024,7 @@
                 <w:sz w:val="21"/>
                 <w:szCs w:val="21"/>
               </w:rPr>
-              <w:t xml:space="preserve">Drop the full weekend prints with it, or first.</w:t>
+              <w:t xml:space="preserve">Open the prints in Word, save as .docx, drop the new file.</w:t>
             </w:r>
           </w:p>
         </w:tc>
@@ -12994,7 +13053,7 @@
                 <w:sz w:val="21"/>
                 <w:szCs w:val="21"/>
               </w:rPr>
-              <w:t xml:space="preserve">"… that reissue belongs to a different day."</w:t>
+              <w:t xml:space="preserve">"That isn't the diagram prints. …"</w:t>
             </w:r>
           </w:p>
         </w:tc>
@@ -13019,7 +13078,257 @@
                 <w:sz w:val="21"/>
                 <w:szCs w:val="21"/>
               </w:rPr>
+              <w:t xml:space="preserve">A text or CSV save whose columns were lost. Save it again, or paste it from Word.</w:t>
+            </w:r>
+          </w:p>
+        </w:tc>
+      </w:tr>
+      <w:tr>
+        <w:tc>
+          <w:tcPr>
+            <w:tcW w:type="dxa" w:w="4535"/>
+            <w:tcMar>
+              <w:top w:type="dxa" w:w="90"/>
+              <w:left w:type="dxa" w:w="120"/>
+              <w:bottom w:type="dxa" w:w="90"/>
+              <w:right w:type="dxa" w:w="120"/>
+            </w:tcMar>
+          </w:tcPr>
+          <w:p>
+            <w:pPr>
+              <w:spacing w:line="264" w:lineRule="auto"/>
+            </w:pPr>
+            <w:r>
+              <w:rPr>
+                <w:rFonts w:ascii="Calibri" w:cs="Calibri" w:eastAsia="Calibri" w:hAnsi="Calibri"/>
+                <w:i/>
+                <w:iCs/>
+                <w:color w:val="262E33"/>
+                <w:sz w:val="21"/>
+                <w:szCs w:val="21"/>
+              </w:rPr>
+              <w:t xml:space="preserve">"That looks like a reissue on its own — …"</w:t>
+            </w:r>
+          </w:p>
+        </w:tc>
+        <w:tc>
+          <w:tcPr>
+            <w:tcW w:type="dxa" w:w="4535"/>
+            <w:tcMar>
+              <w:top w:type="dxa" w:w="90"/>
+              <w:left w:type="dxa" w:w="120"/>
+              <w:bottom w:type="dxa" w:w="90"/>
+              <w:right w:type="dxa" w:w="120"/>
+            </w:tcMar>
+          </w:tcPr>
+          <w:p>
+            <w:pPr>
+              <w:spacing w:line="264" w:lineRule="auto"/>
+            </w:pPr>
+            <w:r>
+              <w:rPr>
+                <w:rFonts w:ascii="Calibri" w:cs="Calibri" w:eastAsia="Calibri" w:hAnsi="Calibri"/>
+                <w:color w:val="262E33"/>
+                <w:sz w:val="21"/>
+                <w:szCs w:val="21"/>
+              </w:rPr>
+              <w:t xml:space="preserve">Drop the full weekend prints with it, or first.</w:t>
+            </w:r>
+          </w:p>
+        </w:tc>
+      </w:tr>
+      <w:tr>
+        <w:tc>
+          <w:tcPr>
+            <w:tcW w:type="dxa" w:w="4535"/>
+            <w:tcMar>
+              <w:top w:type="dxa" w:w="90"/>
+              <w:left w:type="dxa" w:w="120"/>
+              <w:bottom w:type="dxa" w:w="90"/>
+              <w:right w:type="dxa" w:w="120"/>
+            </w:tcMar>
+          </w:tcPr>
+          <w:p>
+            <w:pPr>
+              <w:spacing w:line="264" w:lineRule="auto"/>
+            </w:pPr>
+            <w:r>
+              <w:rPr>
+                <w:rFonts w:ascii="Calibri" w:cs="Calibri" w:eastAsia="Calibri" w:hAnsi="Calibri"/>
+                <w:i/>
+                <w:iCs/>
+                <w:color w:val="262E33"/>
+                <w:sz w:val="21"/>
+                <w:szCs w:val="21"/>
+              </w:rPr>
+              <w:t xml:space="preserve">"… that reissue belongs to a different day."</w:t>
+            </w:r>
+          </w:p>
+        </w:tc>
+        <w:tc>
+          <w:tcPr>
+            <w:tcW w:type="dxa" w:w="4535"/>
+            <w:tcMar>
+              <w:top w:type="dxa" w:w="90"/>
+              <w:left w:type="dxa" w:w="120"/>
+              <w:bottom w:type="dxa" w:w="90"/>
+              <w:right w:type="dxa" w:w="120"/>
+            </w:tcMar>
+          </w:tcPr>
+          <w:p>
+            <w:pPr>
+              <w:spacing w:line="264" w:lineRule="auto"/>
+            </w:pPr>
+            <w:r>
+              <w:rPr>
+                <w:rFonts w:ascii="Calibri" w:cs="Calibri" w:eastAsia="Calibri" w:hAnsi="Calibri"/>
+                <w:color w:val="262E33"/>
+                <w:sz w:val="21"/>
+                <w:szCs w:val="21"/>
+              </w:rPr>
               <w:t xml:space="preserve">The reissue's date does not match the prints.</w:t>
+            </w:r>
+          </w:p>
+        </w:tc>
+      </w:tr>
+      <w:tr>
+        <w:tc>
+          <w:tcPr>
+            <w:tcW w:type="dxa" w:w="4535"/>
+            <w:tcMar>
+              <w:top w:type="dxa" w:w="90"/>
+              <w:left w:type="dxa" w:w="120"/>
+              <w:bottom w:type="dxa" w:w="90"/>
+              <w:right w:type="dxa" w:w="120"/>
+            </w:tcMar>
+          </w:tcPr>
+          <w:p>
+            <w:pPr>
+              <w:spacing w:line="264" w:lineRule="auto"/>
+            </w:pPr>
+            <w:r>
+              <w:rPr>
+                <w:rFonts w:ascii="Calibri" w:cs="Calibri" w:eastAsia="Calibri" w:hAnsi="Calibri"/>
+                <w:i/>
+                <w:iCs/>
+                <w:color w:val="262E33"/>
+                <w:sz w:val="21"/>
+                <w:szCs w:val="21"/>
+              </w:rPr>
+              <w:t xml:space="preserve">"That pair could not be read: the Diagram Detail has no diagrams in it — …"</w:t>
+            </w:r>
+            <w:r>
+              <w:rPr>
+                <w:rFonts w:ascii="Calibri" w:cs="Calibri" w:eastAsia="Calibri" w:hAnsi="Calibri"/>
+                <w:color w:val="262E33"/>
+                <w:sz w:val="21"/>
+                <w:szCs w:val="21"/>
+              </w:rPr>
+              <w:t xml:space="preserve"> (Shortages &amp; variations)</w:t>
+            </w:r>
+          </w:p>
+        </w:tc>
+        <w:tc>
+          <w:tcPr>
+            <w:tcW w:type="dxa" w:w="4535"/>
+            <w:tcMar>
+              <w:top w:type="dxa" w:w="90"/>
+              <w:left w:type="dxa" w:w="120"/>
+              <w:bottom w:type="dxa" w:w="90"/>
+              <w:right w:type="dxa" w:w="120"/>
+            </w:tcMar>
+          </w:tcPr>
+          <w:p>
+            <w:pPr>
+              <w:spacing w:line="264" w:lineRule="auto"/>
+            </w:pPr>
+            <w:r>
+              <w:rPr>
+                <w:rFonts w:ascii="Calibri" w:cs="Calibri" w:eastAsia="Calibri" w:hAnsi="Calibri"/>
+                <w:color w:val="262E33"/>
+                <w:sz w:val="21"/>
+                <w:szCs w:val="21"/>
+              </w:rPr>
+              <w:t xml:space="preserve">The Diagram Detail was saved or copied without its diagrams — often just its first line. Save the whole report from Genius again, or copy it from the very top, and drop or paste that.</w:t>
+            </w:r>
+          </w:p>
+        </w:tc>
+      </w:tr>
+      <w:tr>
+        <w:tc>
+          <w:tcPr>
+            <w:tcW w:type="dxa" w:w="4535"/>
+            <w:tcMar>
+              <w:top w:type="dxa" w:w="90"/>
+              <w:left w:type="dxa" w:w="120"/>
+              <w:bottom w:type="dxa" w:w="90"/>
+              <w:right w:type="dxa" w:w="120"/>
+            </w:tcMar>
+          </w:tcPr>
+          <w:p>
+            <w:pPr>
+              <w:spacing w:line="264" w:lineRule="auto"/>
+            </w:pPr>
+            <w:r>
+              <w:rPr>
+                <w:rFonts w:ascii="Consolas" w:cs="Consolas" w:eastAsia="Consolas" w:hAnsi="Consolas"/>
+                <w:color w:val="262E33"/>
+                <w:sz w:val="19"/>
+                <w:szCs w:val="19"/>
+              </w:rPr>
+              <w:t xml:space="preserve">???</w:t>
+            </w:r>
+            <w:r>
+              <w:rPr>
+                <w:rFonts w:ascii="Calibri" w:cs="Calibri" w:eastAsia="Calibri" w:hAnsi="Calibri"/>
+                <w:color w:val="262E33"/>
+                <w:sz w:val="21"/>
+                <w:szCs w:val="21"/>
+              </w:rPr>
+              <w:t xml:space="preserve"> on the variations list</w:t>
+            </w:r>
+          </w:p>
+        </w:tc>
+        <w:tc>
+          <w:tcPr>
+            <w:tcW w:type="dxa" w:w="4535"/>
+            <w:tcMar>
+              <w:top w:type="dxa" w:w="90"/>
+              <w:left w:type="dxa" w:w="120"/>
+              <w:bottom w:type="dxa" w:w="90"/>
+              <w:right w:type="dxa" w:w="120"/>
+            </w:tcMar>
+          </w:tcPr>
+          <w:p>
+            <w:pPr>
+              <w:spacing w:line="264" w:lineRule="auto"/>
+            </w:pPr>
+            <w:r>
+              <w:rPr>
+                <w:rFonts w:ascii="Calibri" w:cs="Calibri" w:eastAsia="Calibri" w:hAnsi="Calibri"/>
+                <w:color w:val="262E33"/>
+                <w:sz w:val="21"/>
+                <w:szCs w:val="21"/>
+              </w:rPr>
+              <w:t xml:space="preserve">A siding, signal or depot road the list has no code for. The Review list under it names the place in full — tell us the code it should be, and it can be added. Plain stations are named by their three-letter code, so Deal is </w:t>
+            </w:r>
+            <w:r>
+              <w:rPr>
+                <w:rFonts w:ascii="Consolas" w:cs="Consolas" w:eastAsia="Consolas" w:hAnsi="Consolas"/>
+                <w:color w:val="262E33"/>
+                <w:sz w:val="19"/>
+                <w:szCs w:val="19"/>
+              </w:rPr>
+              <w:t xml:space="preserve">DEA</w:t>
+            </w:r>
+            <w:r>
+              <w:rPr>
+                <w:rFonts w:ascii="Calibri" w:cs="Calibri" w:eastAsia="Calibri" w:hAnsi="Calibri"/>
+                <w:color w:val="262E33"/>
+                <w:sz w:val="21"/>
+                <w:szCs w:val="21"/>
+              </w:rPr>
+              <w:t xml:space="preserve">.</w:t>
             </w:r>
           </w:p>
         </w:tc>

</xml_diff>

<commit_message>
Shortages: the morning list is this morning's, with a morning/afternoon choice
On the 05/10 Operating Report (printed 03:31) the only shortages were RM029
and RM920, but 23 were listed. Each row is now timed by the Diagram Detail's
day, which runs past midnight, so units going to bed after midnight are
tonight's and drop off. On the morning list a shortage past 09:00 runs on only
along its own diagram and a three-hour stand ends it, so RM029 ends on 5J95
into Grove Park and RM920 on 5J91. A new Shortage list option picks morning
or afternoon whatever the print time, and the status line says which list is
shown. Only the afternoon list leaves off diagrams done by 16:00.

Co-Authored-By: Claude Opus 5.5 <noreply@anthropic.com>
Claude-Session: https://claude.ai/code/session_01Bo8y3CPA6i1JGS4N3h4DXr
</commit_message>
<xml_diff>
--- a/HOW TO USE.docx
+++ b/HOW TO USE.docx
@@ -10736,7 +10736,47 @@
           <w:sz w:val="21"/>
           <w:szCs w:val="21"/>
         </w:rPr>
-        <w:t xml:space="preserve"> line on the Operating Report, inside the window the report's print time puts it in. A shortage that moves from one diagram to another is one item, followed through every service it touches.</w:t>
+        <w:t xml:space="preserve"> line on the Operating Report. A report printed between 01:00 and 08:00 gives the </w:t>
+      </w:r>
+      <w:r>
+        <w:rPr>
+          <w:rFonts w:ascii="Calibri" w:cs="Calibri" w:eastAsia="Calibri" w:hAnsi="Calibri"/>
+          <w:b/>
+          <w:bCs/>
+          <w:color w:val="262E33"/>
+          <w:sz w:val="21"/>
+          <w:szCs w:val="21"/>
+        </w:rPr>
+        <w:t xml:space="preserve">morning list</w:t>
+      </w:r>
+      <w:r>
+        <w:rPr>
+          <w:rFonts w:ascii="Calibri" w:cs="Calibri" w:eastAsia="Calibri" w:hAnsi="Calibri"/>
+          <w:color w:val="262E33"/>
+          <w:sz w:val="21"/>
+          <w:szCs w:val="21"/>
+        </w:rPr>
+        <w:t xml:space="preserve">: the units not allocated for workings that leave before 09:00, each followed as far as the sidings it goes back to. One printed between 08:00 and 18:00 gives the </w:t>
+      </w:r>
+      <w:r>
+        <w:rPr>
+          <w:rFonts w:ascii="Calibri" w:cs="Calibri" w:eastAsia="Calibri" w:hAnsi="Calibri"/>
+          <w:b/>
+          <w:bCs/>
+          <w:color w:val="262E33"/>
+          <w:sz w:val="21"/>
+          <w:szCs w:val="21"/>
+        </w:rPr>
+        <w:t xml:space="preserve">afternoon list</w:t>
+      </w:r>
+      <w:r>
+        <w:rPr>
+          <w:rFonts w:ascii="Calibri" w:cs="Calibri" w:eastAsia="Calibri" w:hAnsi="Calibri"/>
+          <w:color w:val="262E33"/>
+          <w:sz w:val="21"/>
+          <w:szCs w:val="21"/>
+        </w:rPr>
+        <w:t xml:space="preserve">: workings that leave between 12:00 and 18:00, each followed for the rest of its day. A unit going to bed after midnight is tonight's, not this morning's, and is on neither list. A shortage that moves from one diagram to another is one item, followed through every service it touches.</w:t>
       </w:r>
     </w:p>
     <w:p>
@@ -10885,6 +10925,96 @@
           <w:szCs w:val="21"/>
         </w:rPr>
         <w:t xml:space="preserve"> row changes the list on screen and what you copy or save:</w:t>
+      </w:r>
+    </w:p>
+    <w:p>
+      <w:pPr>
+        <w:pStyle w:val="ListParagraph"/>
+        <w:numPr>
+          <w:ilvl w:val="0"/>
+          <w:numId w:val="21"/>
+        </w:numPr>
+        <w:spacing w:after="110" w:line="276" w:lineRule="auto"/>
+      </w:pPr>
+      <w:r>
+        <w:rPr>
+          <w:rFonts w:ascii="Calibri" w:cs="Calibri" w:eastAsia="Calibri" w:hAnsi="Calibri"/>
+          <w:b/>
+          <w:bCs/>
+          <w:color w:val="262E33"/>
+          <w:sz w:val="21"/>
+          <w:szCs w:val="21"/>
+        </w:rPr>
+        <w:t xml:space="preserve">Shortage list</w:t>
+      </w:r>
+      <w:r>
+        <w:rPr>
+          <w:rFonts w:ascii="Calibri" w:cs="Calibri" w:eastAsia="Calibri" w:hAnsi="Calibri"/>
+          <w:color w:val="262E33"/>
+          <w:sz w:val="21"/>
+          <w:szCs w:val="21"/>
+        </w:rPr>
+        <w:t xml:space="preserve"> — </w:t>
+      </w:r>
+      <w:r>
+        <w:rPr>
+          <w:rFonts w:ascii="Calibri" w:cs="Calibri" w:eastAsia="Calibri" w:hAnsi="Calibri"/>
+          <w:i/>
+          <w:iCs/>
+          <w:color w:val="262E33"/>
+          <w:sz w:val="21"/>
+          <w:szCs w:val="21"/>
+        </w:rPr>
+        <w:t xml:space="preserve">by the print time</w:t>
+      </w:r>
+      <w:r>
+        <w:rPr>
+          <w:rFonts w:ascii="Calibri" w:cs="Calibri" w:eastAsia="Calibri" w:hAnsi="Calibri"/>
+          <w:color w:val="262E33"/>
+          <w:sz w:val="21"/>
+          <w:szCs w:val="21"/>
+        </w:rPr>
+        <w:t xml:space="preserve"> (the usual), </w:t>
+      </w:r>
+      <w:r>
+        <w:rPr>
+          <w:rFonts w:ascii="Calibri" w:cs="Calibri" w:eastAsia="Calibri" w:hAnsi="Calibri"/>
+          <w:i/>
+          <w:iCs/>
+          <w:color w:val="262E33"/>
+          <w:sz w:val="21"/>
+          <w:szCs w:val="21"/>
+        </w:rPr>
+        <w:t xml:space="preserve">morning, before 09:00</w:t>
+      </w:r>
+      <w:r>
+        <w:rPr>
+          <w:rFonts w:ascii="Calibri" w:cs="Calibri" w:eastAsia="Calibri" w:hAnsi="Calibri"/>
+          <w:color w:val="262E33"/>
+          <w:sz w:val="21"/>
+          <w:szCs w:val="21"/>
+        </w:rPr>
+        <w:t xml:space="preserve"> or </w:t>
+      </w:r>
+      <w:r>
+        <w:rPr>
+          <w:rFonts w:ascii="Calibri" w:cs="Calibri" w:eastAsia="Calibri" w:hAnsi="Calibri"/>
+          <w:i/>
+          <w:iCs/>
+          <w:color w:val="262E33"/>
+          <w:sz w:val="21"/>
+          <w:szCs w:val="21"/>
+        </w:rPr>
+        <w:t xml:space="preserve">afternoon, 12:00 to 18:00</w:t>
+      </w:r>
+      <w:r>
+        <w:rPr>
+          <w:rFonts w:ascii="Calibri" w:cs="Calibri" w:eastAsia="Calibri" w:hAnsi="Calibri"/>
+          <w:color w:val="262E33"/>
+          <w:sz w:val="21"/>
+          <w:szCs w:val="21"/>
+        </w:rPr>
+        <w:t xml:space="preserve">. Pick one when the report was printed at another time, or you want the other list. The status line says which list you are looking at.</w:t>
       </w:r>
     </w:p>
     <w:p>
@@ -13250,6 +13380,221 @@
                 <w:szCs w:val="21"/>
               </w:rPr>
               <w:t xml:space="preserve">The Diagram Detail was saved or copied without its diagrams — often just its first line. Save the whole report from Genius again, or copy it from the very top, and drop or paste that.</w:t>
+            </w:r>
+          </w:p>
+        </w:tc>
+      </w:tr>
+      <w:tr>
+        <w:tc>
+          <w:tcPr>
+            <w:tcW w:type="dxa" w:w="4535"/>
+            <w:tcMar>
+              <w:top w:type="dxa" w:w="90"/>
+              <w:left w:type="dxa" w:w="120"/>
+              <w:bottom w:type="dxa" w:w="90"/>
+              <w:right w:type="dxa" w:w="120"/>
+            </w:tcMar>
+          </w:tcPr>
+          <w:p>
+            <w:pPr>
+              <w:spacing w:line="264" w:lineRule="auto"/>
+            </w:pPr>
+            <w:r>
+              <w:rPr>
+                <w:rFonts w:ascii="Calibri" w:cs="Calibri" w:eastAsia="Calibri" w:hAnsi="Calibri"/>
+                <w:i/>
+                <w:iCs/>
+                <w:color w:val="262E33"/>
+                <w:sz w:val="21"/>
+                <w:szCs w:val="21"/>
+              </w:rPr>
+              <w:t xml:space="preserve">"No shortages raised … pick morning or afternoon under Shortage list"</w:t>
+            </w:r>
+            <w:r>
+              <w:rPr>
+                <w:rFonts w:ascii="Calibri" w:cs="Calibri" w:eastAsia="Calibri" w:hAnsi="Calibri"/>
+                <w:color w:val="262E33"/>
+                <w:sz w:val="21"/>
+                <w:szCs w:val="21"/>
+              </w:rPr>
+              <w:t xml:space="preserve"> (Shortages &amp; variations)</w:t>
+            </w:r>
+          </w:p>
+        </w:tc>
+        <w:tc>
+          <w:tcPr>
+            <w:tcW w:type="dxa" w:w="4535"/>
+            <w:tcMar>
+              <w:top w:type="dxa" w:w="90"/>
+              <w:left w:type="dxa" w:w="120"/>
+              <w:bottom w:type="dxa" w:w="90"/>
+              <w:right w:type="dxa" w:w="120"/>
+            </w:tcMar>
+          </w:tcPr>
+          <w:p>
+            <w:pPr>
+              <w:spacing w:line="264" w:lineRule="auto"/>
+            </w:pPr>
+            <w:r>
+              <w:rPr>
+                <w:rFonts w:ascii="Calibri" w:cs="Calibri" w:eastAsia="Calibri" w:hAnsi="Calibri"/>
+                <w:color w:val="262E33"/>
+                <w:sz w:val="21"/>
+                <w:szCs w:val="21"/>
+              </w:rPr>
+              <w:t xml:space="preserve">The Operating Report was printed after 18:00, or its print time could not be read, so the tool cannot tell which list you want. Pick </w:t>
+            </w:r>
+            <w:r>
+              <w:rPr>
+                <w:rFonts w:ascii="Calibri" w:cs="Calibri" w:eastAsia="Calibri" w:hAnsi="Calibri"/>
+                <w:b/>
+                <w:bCs/>
+                <w:color w:val="262E33"/>
+                <w:sz w:val="21"/>
+                <w:szCs w:val="21"/>
+              </w:rPr>
+              <w:t xml:space="preserve">morning</w:t>
+            </w:r>
+            <w:r>
+              <w:rPr>
+                <w:rFonts w:ascii="Calibri" w:cs="Calibri" w:eastAsia="Calibri" w:hAnsi="Calibri"/>
+                <w:color w:val="262E33"/>
+                <w:sz w:val="21"/>
+                <w:szCs w:val="21"/>
+              </w:rPr>
+              <w:t xml:space="preserve"> or </w:t>
+            </w:r>
+            <w:r>
+              <w:rPr>
+                <w:rFonts w:ascii="Calibri" w:cs="Calibri" w:eastAsia="Calibri" w:hAnsi="Calibri"/>
+                <w:b/>
+                <w:bCs/>
+                <w:color w:val="262E33"/>
+                <w:sz w:val="21"/>
+                <w:szCs w:val="21"/>
+              </w:rPr>
+              <w:t xml:space="preserve">afternoon</w:t>
+            </w:r>
+            <w:r>
+              <w:rPr>
+                <w:rFonts w:ascii="Calibri" w:cs="Calibri" w:eastAsia="Calibri" w:hAnsi="Calibri"/>
+                <w:color w:val="262E33"/>
+                <w:sz w:val="21"/>
+                <w:szCs w:val="21"/>
+              </w:rPr>
+              <w:t xml:space="preserve"> under </w:t>
+            </w:r>
+            <w:r>
+              <w:rPr>
+                <w:rFonts w:ascii="Calibri" w:cs="Calibri" w:eastAsia="Calibri" w:hAnsi="Calibri"/>
+                <w:b/>
+                <w:bCs/>
+                <w:color w:val="262E33"/>
+                <w:sz w:val="21"/>
+                <w:szCs w:val="21"/>
+              </w:rPr>
+              <w:t xml:space="preserve">Shortage list</w:t>
+            </w:r>
+            <w:r>
+              <w:rPr>
+                <w:rFonts w:ascii="Calibri" w:cs="Calibri" w:eastAsia="Calibri" w:hAnsi="Calibri"/>
+                <w:color w:val="262E33"/>
+                <w:sz w:val="21"/>
+                <w:szCs w:val="21"/>
+              </w:rPr>
+              <w:t xml:space="preserve"> in Options.</w:t>
+            </w:r>
+          </w:p>
+        </w:tc>
+      </w:tr>
+      <w:tr>
+        <w:tc>
+          <w:tcPr>
+            <w:tcW w:type="dxa" w:w="4535"/>
+            <w:tcMar>
+              <w:top w:type="dxa" w:w="90"/>
+              <w:left w:type="dxa" w:w="120"/>
+              <w:bottom w:type="dxa" w:w="90"/>
+              <w:right w:type="dxa" w:w="120"/>
+            </w:tcMar>
+          </w:tcPr>
+          <w:p>
+            <w:pPr>
+              <w:spacing w:line="264" w:lineRule="auto"/>
+            </w:pPr>
+            <w:r>
+              <w:rPr>
+                <w:rFonts w:ascii="Calibri" w:cs="Calibri" w:eastAsia="Calibri" w:hAnsi="Calibri"/>
+                <w:color w:val="262E33"/>
+                <w:sz w:val="21"/>
+                <w:szCs w:val="21"/>
+              </w:rPr>
+              <w:t xml:space="preserve">Shortages you know are fine, or afternoon units on a morning list (Shortages &amp; variations)</w:t>
+            </w:r>
+          </w:p>
+        </w:tc>
+        <w:tc>
+          <w:tcPr>
+            <w:tcW w:type="dxa" w:w="4535"/>
+            <w:tcMar>
+              <w:top w:type="dxa" w:w="90"/>
+              <w:left w:type="dxa" w:w="120"/>
+              <w:bottom w:type="dxa" w:w="90"/>
+              <w:right w:type="dxa" w:w="120"/>
+            </w:tcMar>
+          </w:tcPr>
+          <w:p>
+            <w:pPr>
+              <w:spacing w:line="264" w:lineRule="auto"/>
+            </w:pPr>
+            <w:r>
+              <w:rPr>
+                <w:rFonts w:ascii="Calibri" w:cs="Calibri" w:eastAsia="Calibri" w:hAnsi="Calibri"/>
+                <w:color w:val="262E33"/>
+                <w:sz w:val="21"/>
+                <w:szCs w:val="21"/>
+              </w:rPr>
+              <w:t xml:space="preserve">Check the status line says the list you meant — </w:t>
+            </w:r>
+            <w:r>
+              <w:rPr>
+                <w:rFonts w:ascii="Calibri" w:cs="Calibri" w:eastAsia="Calibri" w:hAnsi="Calibri"/>
+                <w:i/>
+                <w:iCs/>
+                <w:color w:val="262E33"/>
+                <w:sz w:val="21"/>
+                <w:szCs w:val="21"/>
+              </w:rPr>
+              <w:t xml:space="preserve">Morning list</w:t>
+            </w:r>
+            <w:r>
+              <w:rPr>
+                <w:rFonts w:ascii="Calibri" w:cs="Calibri" w:eastAsia="Calibri" w:hAnsi="Calibri"/>
+                <w:color w:val="262E33"/>
+                <w:sz w:val="21"/>
+                <w:szCs w:val="21"/>
+              </w:rPr>
+              <w:t xml:space="preserve"> or </w:t>
+            </w:r>
+            <w:r>
+              <w:rPr>
+                <w:rFonts w:ascii="Calibri" w:cs="Calibri" w:eastAsia="Calibri" w:hAnsi="Calibri"/>
+                <w:i/>
+                <w:iCs/>
+                <w:color w:val="262E33"/>
+                <w:sz w:val="21"/>
+                <w:szCs w:val="21"/>
+              </w:rPr>
+              <w:t xml:space="preserve">Afternoon list</w:t>
+            </w:r>
+            <w:r>
+              <w:rPr>
+                <w:rFonts w:ascii="Calibri" w:cs="Calibri" w:eastAsia="Calibri" w:hAnsi="Calibri"/>
+                <w:color w:val="262E33"/>
+                <w:sz w:val="21"/>
+                <w:szCs w:val="21"/>
+              </w:rPr>
+              <w:t xml:space="preserve">. A report printed early in the morning has nothing allocated for the afternoon yet, so its afternoon list is long.</w:t>
             </w:r>
           </w:p>
         </w:tc>

</xml_diff>

<commit_message>
Shortages: how to pull the Operating Report; paste boxes one size
The Shortages & variations how-to, the guide and the README now say to pull
the Operating Report with Unallocated legs ticked and for depot RM (Mainline)
or SG (Metro), and the Review list says when a report was pulled for another
depot or has no Not allocated lines at all.

The note standing in for a held paste wraps to its box instead of running
off the edge behind a scroll bar, and the box goes back to not wrapping when
emptied. Every paste box, on every tab, is the same size: two equal columns
(one on a phone), each box's note beside its name so the boxes start level.

Co-Authored-By: Claude Opus 5.5 <noreply@anthropic.com>
Claude-Session: https://claude.ai/code/session_01Bo8y3CPA6i1JGS4N3h4DXr
</commit_message>
<xml_diff>
--- a/HOW TO USE.docx
+++ b/HOW TO USE.docx
@@ -10289,6 +10289,125 @@
           <w:sz w:val="21"/>
           <w:szCs w:val="21"/>
         </w:rPr>
+        <w:t xml:space="preserve">Pull the </w:t>
+      </w:r>
+      <w:r>
+        <w:rPr>
+          <w:rFonts w:ascii="Calibri" w:cs="Calibri" w:eastAsia="Calibri" w:hAnsi="Calibri"/>
+          <w:b/>
+          <w:bCs/>
+          <w:color w:val="262E33"/>
+          <w:sz w:val="21"/>
+          <w:szCs w:val="21"/>
+        </w:rPr>
+        <w:t xml:space="preserve">Operating Report</w:t>
+      </w:r>
+      <w:r>
+        <w:rPr>
+          <w:rFonts w:ascii="Calibri" w:cs="Calibri" w:eastAsia="Calibri" w:hAnsi="Calibri"/>
+          <w:color w:val="262E33"/>
+          <w:sz w:val="21"/>
+          <w:szCs w:val="21"/>
+        </w:rPr>
+        <w:t xml:space="preserve"> from Genius with </w:t>
+      </w:r>
+      <w:r>
+        <w:rPr>
+          <w:rFonts w:ascii="Calibri" w:cs="Calibri" w:eastAsia="Calibri" w:hAnsi="Calibri"/>
+          <w:b/>
+          <w:bCs/>
+          <w:color w:val="262E33"/>
+          <w:sz w:val="21"/>
+          <w:szCs w:val="21"/>
+        </w:rPr>
+        <w:t xml:space="preserve">Unallocated legs</w:t>
+      </w:r>
+      <w:r>
+        <w:rPr>
+          <w:rFonts w:ascii="Calibri" w:cs="Calibri" w:eastAsia="Calibri" w:hAnsi="Calibri"/>
+          <w:color w:val="262E33"/>
+          <w:sz w:val="21"/>
+          <w:szCs w:val="21"/>
+        </w:rPr>
+        <w:t xml:space="preserve"> ticked, and the depot set to </w:t>
+      </w:r>
+      <w:r>
+        <w:rPr>
+          <w:rFonts w:ascii="Calibri" w:cs="Calibri" w:eastAsia="Calibri" w:hAnsi="Calibri"/>
+          <w:b/>
+          <w:bCs/>
+          <w:color w:val="262E33"/>
+          <w:sz w:val="21"/>
+          <w:szCs w:val="21"/>
+        </w:rPr>
+        <w:t xml:space="preserve">RM</w:t>
+      </w:r>
+      <w:r>
+        <w:rPr>
+          <w:rFonts w:ascii="Calibri" w:cs="Calibri" w:eastAsia="Calibri" w:hAnsi="Calibri"/>
+          <w:color w:val="262E33"/>
+          <w:sz w:val="21"/>
+          <w:szCs w:val="21"/>
+        </w:rPr>
+        <w:t xml:space="preserve"> for Mainline or </w:t>
+      </w:r>
+      <w:r>
+        <w:rPr>
+          <w:rFonts w:ascii="Calibri" w:cs="Calibri" w:eastAsia="Calibri" w:hAnsi="Calibri"/>
+          <w:b/>
+          <w:bCs/>
+          <w:color w:val="262E33"/>
+          <w:sz w:val="21"/>
+          <w:szCs w:val="21"/>
+        </w:rPr>
+        <w:t xml:space="preserve">SG</w:t>
+      </w:r>
+      <w:r>
+        <w:rPr>
+          <w:rFonts w:ascii="Calibri" w:cs="Calibri" w:eastAsia="Calibri" w:hAnsi="Calibri"/>
+          <w:color w:val="262E33"/>
+          <w:sz w:val="21"/>
+          <w:szCs w:val="21"/>
+        </w:rPr>
+        <w:t xml:space="preserve"> for Metro. Without Unallocated legs the report has no </w:t>
+      </w:r>
+      <w:r>
+        <w:rPr>
+          <w:rFonts w:ascii="Calibri" w:cs="Calibri" w:eastAsia="Calibri" w:hAnsi="Calibri"/>
+          <w:i/>
+          <w:iCs/>
+          <w:color w:val="262E33"/>
+          <w:sz w:val="21"/>
+          <w:szCs w:val="21"/>
+        </w:rPr>
+        <w:t xml:space="preserve">Not allocated</w:t>
+      </w:r>
+      <w:r>
+        <w:rPr>
+          <w:rFonts w:ascii="Calibri" w:cs="Calibri" w:eastAsia="Calibri" w:hAnsi="Calibri"/>
+          <w:color w:val="262E33"/>
+          <w:sz w:val="21"/>
+          <w:szCs w:val="21"/>
+        </w:rPr>
+        <w:t xml:space="preserve"> lines, so no shortages can be found.</w:t>
+      </w:r>
+    </w:p>
+    <w:p>
+      <w:pPr>
+        <w:pStyle w:val="ListParagraph"/>
+        <w:numPr>
+          <w:ilvl w:val="0"/>
+          <w:numId w:val="19"/>
+        </w:numPr>
+        <w:spacing w:after="110" w:line="276" w:lineRule="auto"/>
+      </w:pPr>
+      <w:r>
+        <w:rPr>
+          <w:rFonts w:ascii="Calibri" w:cs="Calibri" w:eastAsia="Calibri" w:hAnsi="Calibri"/>
+          <w:color w:val="262E33"/>
+          <w:sz w:val="21"/>
+          <w:szCs w:val="21"/>
+        </w:rPr>
         <w:t xml:space="preserve">Pick </w:t>
       </w:r>
       <w:r>
@@ -13503,6 +13622,192 @@
                 <w:szCs w:val="21"/>
               </w:rPr>
               <w:t xml:space="preserve"> in Options.</w:t>
+            </w:r>
+          </w:p>
+        </w:tc>
+      </w:tr>
+      <w:tr>
+        <w:tc>
+          <w:tcPr>
+            <w:tcW w:type="dxa" w:w="4535"/>
+            <w:tcMar>
+              <w:top w:type="dxa" w:w="90"/>
+              <w:left w:type="dxa" w:w="120"/>
+              <w:bottom w:type="dxa" w:w="90"/>
+              <w:right w:type="dxa" w:w="120"/>
+            </w:tcMar>
+          </w:tcPr>
+          <w:p>
+            <w:pPr>
+              <w:spacing w:line="264" w:lineRule="auto"/>
+            </w:pPr>
+            <w:r>
+              <w:rPr>
+                <w:rFonts w:ascii="Calibri" w:cs="Calibri" w:eastAsia="Calibri" w:hAnsi="Calibri"/>
+                <w:i/>
+                <w:iCs/>
+                <w:color w:val="262E33"/>
+                <w:sz w:val="21"/>
+                <w:szCs w:val="21"/>
+              </w:rPr>
+              <w:t xml:space="preserve">"The Operating Report has no Not allocated lines …"</w:t>
+            </w:r>
+            <w:r>
+              <w:rPr>
+                <w:rFonts w:ascii="Calibri" w:cs="Calibri" w:eastAsia="Calibri" w:hAnsi="Calibri"/>
+                <w:color w:val="262E33"/>
+                <w:sz w:val="21"/>
+                <w:szCs w:val="21"/>
+              </w:rPr>
+              <w:t xml:space="preserve"> (Shortages &amp; variations)</w:t>
+            </w:r>
+          </w:p>
+        </w:tc>
+        <w:tc>
+          <w:tcPr>
+            <w:tcW w:type="dxa" w:w="4535"/>
+            <w:tcMar>
+              <w:top w:type="dxa" w:w="90"/>
+              <w:left w:type="dxa" w:w="120"/>
+              <w:bottom w:type="dxa" w:w="90"/>
+              <w:right w:type="dxa" w:w="120"/>
+            </w:tcMar>
+          </w:tcPr>
+          <w:p>
+            <w:pPr>
+              <w:spacing w:line="264" w:lineRule="auto"/>
+            </w:pPr>
+            <w:r>
+              <w:rPr>
+                <w:rFonts w:ascii="Calibri" w:cs="Calibri" w:eastAsia="Calibri" w:hAnsi="Calibri"/>
+                <w:color w:val="262E33"/>
+                <w:sz w:val="21"/>
+                <w:szCs w:val="21"/>
+              </w:rPr>
+              <w:t xml:space="preserve">The report was pulled without </w:t>
+            </w:r>
+            <w:r>
+              <w:rPr>
+                <w:rFonts w:ascii="Calibri" w:cs="Calibri" w:eastAsia="Calibri" w:hAnsi="Calibri"/>
+                <w:b/>
+                <w:bCs/>
+                <w:color w:val="262E33"/>
+                <w:sz w:val="21"/>
+                <w:szCs w:val="21"/>
+              </w:rPr>
+              <w:t xml:space="preserve">Unallocated legs</w:t>
+            </w:r>
+            <w:r>
+              <w:rPr>
+                <w:rFonts w:ascii="Calibri" w:cs="Calibri" w:eastAsia="Calibri" w:hAnsi="Calibri"/>
+                <w:color w:val="262E33"/>
+                <w:sz w:val="21"/>
+                <w:szCs w:val="21"/>
+              </w:rPr>
+              <w:t xml:space="preserve"> ticked, so it cannot show what is short. Pull it again from Genius with the box ticked. On a morning with nothing short at all, ignore it.</w:t>
+            </w:r>
+          </w:p>
+        </w:tc>
+      </w:tr>
+      <w:tr>
+        <w:tc>
+          <w:tcPr>
+            <w:tcW w:type="dxa" w:w="4535"/>
+            <w:tcMar>
+              <w:top w:type="dxa" w:w="90"/>
+              <w:left w:type="dxa" w:w="120"/>
+              <w:bottom w:type="dxa" w:w="90"/>
+              <w:right w:type="dxa" w:w="120"/>
+            </w:tcMar>
+          </w:tcPr>
+          <w:p>
+            <w:pPr>
+              <w:spacing w:line="264" w:lineRule="auto"/>
+            </w:pPr>
+            <w:r>
+              <w:rPr>
+                <w:rFonts w:ascii="Calibri" w:cs="Calibri" w:eastAsia="Calibri" w:hAnsi="Calibri"/>
+                <w:i/>
+                <w:iCs/>
+                <w:color w:val="262E33"/>
+                <w:sz w:val="21"/>
+                <w:szCs w:val="21"/>
+              </w:rPr>
+              <w:t xml:space="preserve">"The Operating Report was pulled for depot …"</w:t>
+            </w:r>
+            <w:r>
+              <w:rPr>
+                <w:rFonts w:ascii="Calibri" w:cs="Calibri" w:eastAsia="Calibri" w:hAnsi="Calibri"/>
+                <w:color w:val="262E33"/>
+                <w:sz w:val="21"/>
+                <w:szCs w:val="21"/>
+              </w:rPr>
+              <w:t xml:space="preserve"> (Shortages &amp; variations)</w:t>
+            </w:r>
+          </w:p>
+        </w:tc>
+        <w:tc>
+          <w:tcPr>
+            <w:tcW w:type="dxa" w:w="4535"/>
+            <w:tcMar>
+              <w:top w:type="dxa" w:w="90"/>
+              <w:left w:type="dxa" w:w="120"/>
+              <w:bottom w:type="dxa" w:w="90"/>
+              <w:right w:type="dxa" w:w="120"/>
+            </w:tcMar>
+          </w:tcPr>
+          <w:p>
+            <w:pPr>
+              <w:spacing w:line="264" w:lineRule="auto"/>
+            </w:pPr>
+            <w:r>
+              <w:rPr>
+                <w:rFonts w:ascii="Calibri" w:cs="Calibri" w:eastAsia="Calibri" w:hAnsi="Calibri"/>
+                <w:color w:val="262E33"/>
+                <w:sz w:val="21"/>
+                <w:szCs w:val="21"/>
+              </w:rPr>
+              <w:t xml:space="preserve">Pull it again for depot </w:t>
+            </w:r>
+            <w:r>
+              <w:rPr>
+                <w:rFonts w:ascii="Calibri" w:cs="Calibri" w:eastAsia="Calibri" w:hAnsi="Calibri"/>
+                <w:b/>
+                <w:bCs/>
+                <w:color w:val="262E33"/>
+                <w:sz w:val="21"/>
+                <w:szCs w:val="21"/>
+              </w:rPr>
+              <w:t xml:space="preserve">RM</w:t>
+            </w:r>
+            <w:r>
+              <w:rPr>
+                <w:rFonts w:ascii="Calibri" w:cs="Calibri" w:eastAsia="Calibri" w:hAnsi="Calibri"/>
+                <w:color w:val="262E33"/>
+                <w:sz w:val="21"/>
+                <w:szCs w:val="21"/>
+              </w:rPr>
+              <w:t xml:space="preserve"> (Mainline) or </w:t>
+            </w:r>
+            <w:r>
+              <w:rPr>
+                <w:rFonts w:ascii="Calibri" w:cs="Calibri" w:eastAsia="Calibri" w:hAnsi="Calibri"/>
+                <w:b/>
+                <w:bCs/>
+                <w:color w:val="262E33"/>
+                <w:sz w:val="21"/>
+                <w:szCs w:val="21"/>
+              </w:rPr>
+              <w:t xml:space="preserve">SG</w:t>
+            </w:r>
+            <w:r>
+              <w:rPr>
+                <w:rFonts w:ascii="Calibri" w:cs="Calibri" w:eastAsia="Calibri" w:hAnsi="Calibri"/>
+                <w:color w:val="262E33"/>
+                <w:sz w:val="21"/>
+                <w:szCs w:val="21"/>
+              </w:rPr>
+              <w:t xml:space="preserve"> (Metro).</w:t>
             </w:r>
           </w:p>
         </w:tc>

</xml_diff>

<commit_message>
Docs: README and user guide for 3.33.x
The guide's overview table and report list say to pull the Operating Report
with Unallocated legs ticked for depot RM or SG; the Shortages section
lists what the Review list warns about (two days, wrong depot, no Not
allocated lines, a print after 18:00, ??? places); the held-paste note is
quoted as it now reads. The README covers the depot and legs checks
(opDepotOf), the held note wrapping to its box (showHeld) and the one paste
box layout on every tab, and the tests that hold them.

Co-Authored-By: Claude Opus 5.5 <noreply@anthropic.com>
Claude-Session: https://claude.ai/code/session_01Bo8y3CPA6i1JGS4N3h4DXr
</commit_message>
<xml_diff>
--- a/HOW TO USE.docx
+++ b/HOW TO USE.docx
@@ -580,7 +580,7 @@
                 <w:sz w:val="21"/>
                 <w:szCs w:val="21"/>
               </w:rPr>
-              <w:t xml:space="preserve"> and the </w:t>
+              <w:t xml:space="preserve"> (Unallocated legs ticked, depot RM or SG) and the </w:t>
             </w:r>
             <w:r>
               <w:rPr>
@@ -616,7 +616,7 @@
                 <w:sz w:val="21"/>
                 <w:szCs w:val="21"/>
               </w:rPr>
-              <w:t xml:space="preserve">The controller's list of what is short or the wrong length — not a book</w:t>
+              <w:t xml:space="preserve">The controller's morning or afternoon list of what is short or the wrong length — not a book</w:t>
             </w:r>
           </w:p>
         </w:tc>
@@ -3201,7 +3201,67 @@
           <w:sz w:val="21"/>
           <w:szCs w:val="21"/>
         </w:rPr>
-        <w:t xml:space="preserve"> for the same day, PDF or CSV. The </w:t>
+        <w:t xml:space="preserve"> for the same day, PDF or CSV. Pull the Operating Report with </w:t>
+      </w:r>
+      <w:r>
+        <w:rPr>
+          <w:rFonts w:ascii="Calibri" w:cs="Calibri" w:eastAsia="Calibri" w:hAnsi="Calibri"/>
+          <w:b/>
+          <w:bCs/>
+          <w:color w:val="262E33"/>
+          <w:sz w:val="21"/>
+          <w:szCs w:val="21"/>
+        </w:rPr>
+        <w:t xml:space="preserve">Unallocated legs</w:t>
+      </w:r>
+      <w:r>
+        <w:rPr>
+          <w:rFonts w:ascii="Calibri" w:cs="Calibri" w:eastAsia="Calibri" w:hAnsi="Calibri"/>
+          <w:color w:val="262E33"/>
+          <w:sz w:val="21"/>
+          <w:szCs w:val="21"/>
+        </w:rPr>
+        <w:t xml:space="preserve"> ticked, for depot </w:t>
+      </w:r>
+      <w:r>
+        <w:rPr>
+          <w:rFonts w:ascii="Calibri" w:cs="Calibri" w:eastAsia="Calibri" w:hAnsi="Calibri"/>
+          <w:b/>
+          <w:bCs/>
+          <w:color w:val="262E33"/>
+          <w:sz w:val="21"/>
+          <w:szCs w:val="21"/>
+        </w:rPr>
+        <w:t xml:space="preserve">RM</w:t>
+      </w:r>
+      <w:r>
+        <w:rPr>
+          <w:rFonts w:ascii="Calibri" w:cs="Calibri" w:eastAsia="Calibri" w:hAnsi="Calibri"/>
+          <w:color w:val="262E33"/>
+          <w:sz w:val="21"/>
+          <w:szCs w:val="21"/>
+        </w:rPr>
+        <w:t xml:space="preserve"> (Mainline) or </w:t>
+      </w:r>
+      <w:r>
+        <w:rPr>
+          <w:rFonts w:ascii="Calibri" w:cs="Calibri" w:eastAsia="Calibri" w:hAnsi="Calibri"/>
+          <w:b/>
+          <w:bCs/>
+          <w:color w:val="262E33"/>
+          <w:sz w:val="21"/>
+          <w:szCs w:val="21"/>
+        </w:rPr>
+        <w:t xml:space="preserve">SG</w:t>
+      </w:r>
+      <w:r>
+        <w:rPr>
+          <w:rFonts w:ascii="Calibri" w:cs="Calibri" w:eastAsia="Calibri" w:hAnsi="Calibri"/>
+          <w:color w:val="262E33"/>
+          <w:sz w:val="21"/>
+          <w:szCs w:val="21"/>
+        </w:rPr>
+        <w:t xml:space="preserve"> (Metro). The </w:t>
       </w:r>
       <w:r>
         <w:rPr>
@@ -4118,7 +4178,7 @@
           <w:sz w:val="21"/>
           <w:szCs w:val="21"/>
         </w:rPr>
-        <w:t xml:space="preserve"> — a whole week's Detail — is held ready to build rather than shown in the box, so the browser stays quick. The box says what it is holding — </w:t>
+        <w:t xml:space="preserve"> — a whole week's Detail — is held ready to build rather than shown in the box, so the browser stays quick. The box turns green and says what it is holding — </w:t>
       </w:r>
       <w:r>
         <w:rPr>
@@ -4129,16 +4189,16 @@
           <w:sz w:val="21"/>
           <w:szCs w:val="21"/>
         </w:rPr>
-        <w:t xml:space="preserve">"Diagram Detail pasted — 41,210 lines, 5.9 MB — held ready to build, not shown here to keep the page light."</w:t>
-      </w:r>
-      <w:r>
-        <w:rPr>
-          <w:rFonts w:ascii="Calibri" w:cs="Calibri" w:eastAsia="Calibri" w:hAnsi="Calibri"/>
-          <w:color w:val="262E33"/>
-          <w:sz w:val="21"/>
-          <w:szCs w:val="21"/>
-        </w:rPr>
-        <w:t xml:space="preserve"> Paste again to replace it, or type in the box to empty it.</w:t>
+        <w:t xml:space="preserve">"Diagram Detail pasted — 41,210 lines, 5.9 MB. Held ready to build; not shown here, to keep the page light."</w:t>
+      </w:r>
+      <w:r>
+        <w:rPr>
+          <w:rFonts w:ascii="Calibri" w:cs="Calibri" w:eastAsia="Calibri" w:hAnsi="Calibri"/>
+          <w:color w:val="262E33"/>
+          <w:sz w:val="21"/>
+          <w:szCs w:val="21"/>
+        </w:rPr>
+        <w:t xml:space="preserve"> Paste again to replace it, or type in the box to empty it. This works the same in every paste box, on every tab.</w:t>
       </w:r>
     </w:p>
     <w:p>
@@ -10791,7 +10851,7 @@
           <w:sz w:val="21"/>
           <w:szCs w:val="21"/>
         </w:rPr>
-        <w:t xml:space="preserve">. Each box is read by what is in it, so a report in the wrong box is still read right. A Diagram Detail the size of a whole day is held rather than shown, the same as on the weekday tab. PDFs cannot be pasted.</w:t>
+        <w:t xml:space="preserve">. Each box is read by what is in it, so a report in the wrong box is still read right. A Diagram Detail the size of a whole day is held rather than shown — the box turns green and says what it holds, the same as on the weekday tab. PDFs cannot be pasted.</w:t>
       </w:r>
     </w:p>
     <w:p>
@@ -11401,8 +11461,331 @@
           <w:sz w:val="21"/>
           <w:szCs w:val="21"/>
         </w:rPr>
-        <w:t xml:space="preserve">, and the Review list names it in full so the code can be added. </w:t>
-      </w:r>
+        <w:t xml:space="preserve">, and the Review list names it in full so the code can be added.</w:t>
+      </w:r>
+    </w:p>
+    <w:p>
+      <w:pPr>
+        <w:spacing w:after="140" w:line="276" w:lineRule="auto"/>
+      </w:pPr>
+      <w:r>
+        <w:rPr>
+          <w:rFonts w:ascii="Calibri" w:cs="Calibri" w:eastAsia="Calibri" w:hAnsi="Calibri"/>
+          <w:b/>
+          <w:bCs/>
+          <w:color w:val="262E33"/>
+          <w:sz w:val="21"/>
+          <w:szCs w:val="21"/>
+        </w:rPr>
+        <w:t xml:space="preserve">The Review list</w:t>
+      </w:r>
+      <w:r>
+        <w:rPr>
+          <w:rFonts w:ascii="Calibri" w:cs="Calibri" w:eastAsia="Calibri" w:hAnsi="Calibri"/>
+          <w:color w:val="262E33"/>
+          <w:sz w:val="21"/>
+          <w:szCs w:val="21"/>
+        </w:rPr>
+        <w:t xml:space="preserve"> under the list says when something about the reports means the list cannot be trusted as it stands:</w:t>
+      </w:r>
+    </w:p>
+    <w:p>
+      <w:pPr>
+        <w:pStyle w:val="ListParagraph"/>
+        <w:numPr>
+          <w:ilvl w:val="0"/>
+          <w:numId w:val="22"/>
+        </w:numPr>
+        <w:spacing w:after="110" w:line="276" w:lineRule="auto"/>
+      </w:pPr>
+      <w:r>
+        <w:rPr>
+          <w:rFonts w:ascii="Calibri" w:cs="Calibri" w:eastAsia="Calibri" w:hAnsi="Calibri"/>
+          <w:color w:val="262E33"/>
+          <w:sz w:val="21"/>
+          <w:szCs w:val="21"/>
+        </w:rPr>
+        <w:t xml:space="preserve">the Operating Report and the Diagram Detail are for </w:t>
+      </w:r>
+      <w:r>
+        <w:rPr>
+          <w:rFonts w:ascii="Calibri" w:cs="Calibri" w:eastAsia="Calibri" w:hAnsi="Calibri"/>
+          <w:b/>
+          <w:bCs/>
+          <w:color w:val="262E33"/>
+          <w:sz w:val="21"/>
+          <w:szCs w:val="21"/>
+        </w:rPr>
+        <w:t xml:space="preserve">different days</w:t>
+      </w:r>
+      <w:r>
+        <w:rPr>
+          <w:rFonts w:ascii="Calibri" w:cs="Calibri" w:eastAsia="Calibri" w:hAnsi="Calibri"/>
+          <w:color w:val="262E33"/>
+          <w:sz w:val="21"/>
+          <w:szCs w:val="21"/>
+        </w:rPr>
+        <w:t xml:space="preserve">;</w:t>
+      </w:r>
+    </w:p>
+    <w:p>
+      <w:pPr>
+        <w:pStyle w:val="ListParagraph"/>
+        <w:numPr>
+          <w:ilvl w:val="0"/>
+          <w:numId w:val="22"/>
+        </w:numPr>
+        <w:spacing w:after="110" w:line="276" w:lineRule="auto"/>
+      </w:pPr>
+      <w:r>
+        <w:rPr>
+          <w:rFonts w:ascii="Calibri" w:cs="Calibri" w:eastAsia="Calibri" w:hAnsi="Calibri"/>
+          <w:color w:val="262E33"/>
+          <w:sz w:val="21"/>
+          <w:szCs w:val="21"/>
+        </w:rPr>
+        <w:t xml:space="preserve">the Operating Report was pulled for a depot other than </w:t>
+      </w:r>
+      <w:r>
+        <w:rPr>
+          <w:rFonts w:ascii="Calibri" w:cs="Calibri" w:eastAsia="Calibri" w:hAnsi="Calibri"/>
+          <w:b/>
+          <w:bCs/>
+          <w:color w:val="262E33"/>
+          <w:sz w:val="21"/>
+          <w:szCs w:val="21"/>
+        </w:rPr>
+        <w:t xml:space="preserve">RM</w:t>
+      </w:r>
+      <w:r>
+        <w:rPr>
+          <w:rFonts w:ascii="Calibri" w:cs="Calibri" w:eastAsia="Calibri" w:hAnsi="Calibri"/>
+          <w:color w:val="262E33"/>
+          <w:sz w:val="21"/>
+          <w:szCs w:val="21"/>
+        </w:rPr>
+        <w:t xml:space="preserve"> or </w:t>
+      </w:r>
+      <w:r>
+        <w:rPr>
+          <w:rFonts w:ascii="Calibri" w:cs="Calibri" w:eastAsia="Calibri" w:hAnsi="Calibri"/>
+          <w:b/>
+          <w:bCs/>
+          <w:color w:val="262E33"/>
+          <w:sz w:val="21"/>
+          <w:szCs w:val="21"/>
+        </w:rPr>
+        <w:t xml:space="preserve">SG</w:t>
+      </w:r>
+      <w:r>
+        <w:rPr>
+          <w:rFonts w:ascii="Calibri" w:cs="Calibri" w:eastAsia="Calibri" w:hAnsi="Calibri"/>
+          <w:color w:val="262E33"/>
+          <w:sz w:val="21"/>
+          <w:szCs w:val="21"/>
+        </w:rPr>
+        <w:t xml:space="preserve">;</w:t>
+      </w:r>
+    </w:p>
+    <w:p>
+      <w:pPr>
+        <w:pStyle w:val="ListParagraph"/>
+        <w:numPr>
+          <w:ilvl w:val="0"/>
+          <w:numId w:val="22"/>
+        </w:numPr>
+        <w:spacing w:after="110" w:line="276" w:lineRule="auto"/>
+      </w:pPr>
+      <w:r>
+        <w:rPr>
+          <w:rFonts w:ascii="Calibri" w:cs="Calibri" w:eastAsia="Calibri" w:hAnsi="Calibri"/>
+          <w:color w:val="262E33"/>
+          <w:sz w:val="21"/>
+          <w:szCs w:val="21"/>
+        </w:rPr>
+        <w:t xml:space="preserve">the Operating Report has </w:t>
+      </w:r>
+      <w:r>
+        <w:rPr>
+          <w:rFonts w:ascii="Calibri" w:cs="Calibri" w:eastAsia="Calibri" w:hAnsi="Calibri"/>
+          <w:b/>
+          <w:bCs/>
+          <w:color w:val="262E33"/>
+          <w:sz w:val="21"/>
+          <w:szCs w:val="21"/>
+        </w:rPr>
+        <w:t xml:space="preserve">no Not allocated lines</w:t>
+      </w:r>
+      <w:r>
+        <w:rPr>
+          <w:rFonts w:ascii="Calibri" w:cs="Calibri" w:eastAsia="Calibri" w:hAnsi="Calibri"/>
+          <w:color w:val="262E33"/>
+          <w:sz w:val="21"/>
+          <w:szCs w:val="21"/>
+        </w:rPr>
+        <w:t xml:space="preserve"> — pulled without </w:t>
+      </w:r>
+      <w:r>
+        <w:rPr>
+          <w:rFonts w:ascii="Calibri" w:cs="Calibri" w:eastAsia="Calibri" w:hAnsi="Calibri"/>
+          <w:b/>
+          <w:bCs/>
+          <w:color w:val="262E33"/>
+          <w:sz w:val="21"/>
+          <w:szCs w:val="21"/>
+        </w:rPr>
+        <w:t xml:space="preserve">Unallocated legs</w:t>
+      </w:r>
+      <w:r>
+        <w:rPr>
+          <w:rFonts w:ascii="Calibri" w:cs="Calibri" w:eastAsia="Calibri" w:hAnsi="Calibri"/>
+          <w:color w:val="262E33"/>
+          <w:sz w:val="21"/>
+          <w:szCs w:val="21"/>
+        </w:rPr>
+        <w:t xml:space="preserve"> ticked, or a day with nothing short at all;</w:t>
+      </w:r>
+    </w:p>
+    <w:p>
+      <w:pPr>
+        <w:pStyle w:val="ListParagraph"/>
+        <w:numPr>
+          <w:ilvl w:val="0"/>
+          <w:numId w:val="22"/>
+        </w:numPr>
+        <w:spacing w:after="110" w:line="276" w:lineRule="auto"/>
+      </w:pPr>
+      <w:r>
+        <w:rPr>
+          <w:rFonts w:ascii="Calibri" w:cs="Calibri" w:eastAsia="Calibri" w:hAnsi="Calibri"/>
+          <w:color w:val="262E33"/>
+          <w:sz w:val="21"/>
+          <w:szCs w:val="21"/>
+        </w:rPr>
+        <w:t xml:space="preserve">the report was printed </w:t>
+      </w:r>
+      <w:r>
+        <w:rPr>
+          <w:rFonts w:ascii="Calibri" w:cs="Calibri" w:eastAsia="Calibri" w:hAnsi="Calibri"/>
+          <w:b/>
+          <w:bCs/>
+          <w:color w:val="262E33"/>
+          <w:sz w:val="21"/>
+          <w:szCs w:val="21"/>
+        </w:rPr>
+        <w:t xml:space="preserve">after 18:00</w:t>
+      </w:r>
+      <w:r>
+        <w:rPr>
+          <w:rFonts w:ascii="Calibri" w:cs="Calibri" w:eastAsia="Calibri" w:hAnsi="Calibri"/>
+          <w:color w:val="262E33"/>
+          <w:sz w:val="21"/>
+          <w:szCs w:val="21"/>
+        </w:rPr>
+        <w:t xml:space="preserve">, or its print time could not be read, so no shortages were raised until you pick </w:t>
+      </w:r>
+      <w:r>
+        <w:rPr>
+          <w:rFonts w:ascii="Calibri" w:cs="Calibri" w:eastAsia="Calibri" w:hAnsi="Calibri"/>
+          <w:b/>
+          <w:bCs/>
+          <w:color w:val="262E33"/>
+          <w:sz w:val="21"/>
+          <w:szCs w:val="21"/>
+        </w:rPr>
+        <w:t xml:space="preserve">morning</w:t>
+      </w:r>
+      <w:r>
+        <w:rPr>
+          <w:rFonts w:ascii="Calibri" w:cs="Calibri" w:eastAsia="Calibri" w:hAnsi="Calibri"/>
+          <w:color w:val="262E33"/>
+          <w:sz w:val="21"/>
+          <w:szCs w:val="21"/>
+        </w:rPr>
+        <w:t xml:space="preserve"> or </w:t>
+      </w:r>
+      <w:r>
+        <w:rPr>
+          <w:rFonts w:ascii="Calibri" w:cs="Calibri" w:eastAsia="Calibri" w:hAnsi="Calibri"/>
+          <w:b/>
+          <w:bCs/>
+          <w:color w:val="262E33"/>
+          <w:sz w:val="21"/>
+          <w:szCs w:val="21"/>
+        </w:rPr>
+        <w:t xml:space="preserve">afternoon</w:t>
+      </w:r>
+      <w:r>
+        <w:rPr>
+          <w:rFonts w:ascii="Calibri" w:cs="Calibri" w:eastAsia="Calibri" w:hAnsi="Calibri"/>
+          <w:color w:val="262E33"/>
+          <w:sz w:val="21"/>
+          <w:szCs w:val="21"/>
+        </w:rPr>
+        <w:t xml:space="preserve"> under </w:t>
+      </w:r>
+      <w:r>
+        <w:rPr>
+          <w:rFonts w:ascii="Calibri" w:cs="Calibri" w:eastAsia="Calibri" w:hAnsi="Calibri"/>
+          <w:b/>
+          <w:bCs/>
+          <w:color w:val="262E33"/>
+          <w:sz w:val="21"/>
+          <w:szCs w:val="21"/>
+        </w:rPr>
+        <w:t xml:space="preserve">Shortage list</w:t>
+      </w:r>
+      <w:r>
+        <w:rPr>
+          <w:rFonts w:ascii="Calibri" w:cs="Calibri" w:eastAsia="Calibri" w:hAnsi="Calibri"/>
+          <w:color w:val="262E33"/>
+          <w:sz w:val="21"/>
+          <w:szCs w:val="21"/>
+        </w:rPr>
+        <w:t xml:space="preserve">;</w:t>
+      </w:r>
+    </w:p>
+    <w:p>
+      <w:pPr>
+        <w:pStyle w:val="ListParagraph"/>
+        <w:numPr>
+          <w:ilvl w:val="0"/>
+          <w:numId w:val="22"/>
+        </w:numPr>
+        <w:spacing w:after="110" w:line="276" w:lineRule="auto"/>
+      </w:pPr>
+      <w:r>
+        <w:rPr>
+          <w:rFonts w:ascii="Calibri" w:cs="Calibri" w:eastAsia="Calibri" w:hAnsi="Calibri"/>
+          <w:color w:val="262E33"/>
+          <w:sz w:val="21"/>
+          <w:szCs w:val="21"/>
+        </w:rPr>
+        <w:t xml:space="preserve">a place the list has no code for, shown as </w:t>
+      </w:r>
+      <w:r>
+        <w:rPr>
+          <w:rFonts w:ascii="Consolas" w:cs="Consolas" w:eastAsia="Consolas" w:hAnsi="Consolas"/>
+          <w:color w:val="262E33"/>
+          <w:sz w:val="19"/>
+          <w:szCs w:val="19"/>
+        </w:rPr>
+        <w:t xml:space="preserve">???</w:t>
+      </w:r>
+      <w:r>
+        <w:rPr>
+          <w:rFonts w:ascii="Calibri" w:cs="Calibri" w:eastAsia="Calibri" w:hAnsi="Calibri"/>
+          <w:color w:val="262E33"/>
+          <w:sz w:val="21"/>
+          <w:szCs w:val="21"/>
+        </w:rPr>
+        <w:t xml:space="preserve">.</w:t>
+      </w:r>
+    </w:p>
+    <w:p>
+      <w:pPr>
+        <w:spacing w:after="140" w:line="276" w:lineRule="auto"/>
+      </w:pPr>
       <w:r>
         <w:rPr>
           <w:rFonts w:ascii="Calibri" w:cs="Calibri" w:eastAsia="Calibri" w:hAnsi="Calibri"/>
@@ -11553,7 +11936,7 @@
         <w:pStyle w:val="ListParagraph"/>
         <w:numPr>
           <w:ilvl w:val="0"/>
-          <w:numId w:val="22"/>
+          <w:numId w:val="23"/>
         </w:numPr>
         <w:spacing w:after="110" w:line="276" w:lineRule="auto"/>
       </w:pPr>
@@ -11636,210 +12019,6 @@
           <w:szCs w:val="21"/>
         </w:rPr>
         <w:t xml:space="preserve"> on the zone. Already built the weekday books? Their reports are used, and you can skip this.</w:t>
-      </w:r>
-    </w:p>
-    <w:p>
-      <w:pPr>
-        <w:pStyle w:val="ListParagraph"/>
-        <w:numPr>
-          <w:ilvl w:val="0"/>
-          <w:numId w:val="22"/>
-        </w:numPr>
-        <w:spacing w:after="110" w:line="276" w:lineRule="auto"/>
-      </w:pPr>
-      <w:r>
-        <w:rPr>
-          <w:rFonts w:ascii="Calibri" w:cs="Calibri" w:eastAsia="Calibri" w:hAnsi="Calibri"/>
-          <w:b/>
-          <w:bCs/>
-          <w:color w:val="262E33"/>
-          <w:sz w:val="21"/>
-          <w:szCs w:val="21"/>
-        </w:rPr>
-        <w:t xml:space="preserve">The plan.</w:t>
-      </w:r>
-      <w:r>
-        <w:rPr>
-          <w:rFonts w:ascii="Calibri" w:cs="Calibri" w:eastAsia="Calibri" w:hAnsi="Calibri"/>
-          <w:color w:val="262E33"/>
-          <w:sz w:val="21"/>
-          <w:szCs w:val="21"/>
-        </w:rPr>
-        <w:t xml:space="preserve"> Copy the </w:t>
-      </w:r>
-      <w:r>
-        <w:rPr>
-          <w:rFonts w:ascii="Calibri" w:cs="Calibri" w:eastAsia="Calibri" w:hAnsi="Calibri"/>
-          <w:b/>
-          <w:bCs/>
-          <w:color w:val="262E33"/>
-          <w:sz w:val="21"/>
-          <w:szCs w:val="21"/>
-        </w:rPr>
-        <w:t xml:space="preserve">Maintenance Plan</w:t>
-      </w:r>
-      <w:r>
-        <w:rPr>
-          <w:rFonts w:ascii="Calibri" w:cs="Calibri" w:eastAsia="Calibri" w:hAnsi="Calibri"/>
-          <w:color w:val="262E33"/>
-          <w:sz w:val="21"/>
-          <w:szCs w:val="21"/>
-        </w:rPr>
-        <w:t xml:space="preserve"> tab out of the Mainline Stock Control Document, or the Metro Stock Telex, and paste it into the </w:t>
-      </w:r>
-      <w:r>
-        <w:rPr>
-          <w:rFonts w:ascii="Calibri" w:cs="Calibri" w:eastAsia="Calibri" w:hAnsi="Calibri"/>
-          <w:b/>
-          <w:bCs/>
-          <w:color w:val="262E33"/>
-          <w:sz w:val="21"/>
-          <w:szCs w:val="21"/>
-        </w:rPr>
-        <w:t xml:space="preserve">Maintenance plan</w:t>
-      </w:r>
-      <w:r>
-        <w:rPr>
-          <w:rFonts w:ascii="Calibri" w:cs="Calibri" w:eastAsia="Calibri" w:hAnsi="Calibri"/>
-          <w:color w:val="262E33"/>
-          <w:sz w:val="21"/>
-          <w:szCs w:val="21"/>
-        </w:rPr>
-        <w:t xml:space="preserve"> box.</w:t>
-      </w:r>
-    </w:p>
-    <w:p>
-      <w:pPr>
-        <w:pStyle w:val="ListParagraph"/>
-        <w:numPr>
-          <w:ilvl w:val="0"/>
-          <w:numId w:val="22"/>
-        </w:numPr>
-        <w:spacing w:after="110" w:line="276" w:lineRule="auto"/>
-      </w:pPr>
-      <w:r>
-        <w:rPr>
-          <w:rFonts w:ascii="Calibri" w:cs="Calibri" w:eastAsia="Calibri" w:hAnsi="Calibri"/>
-          <w:b/>
-          <w:bCs/>
-          <w:color w:val="262E33"/>
-          <w:sz w:val="21"/>
-          <w:szCs w:val="21"/>
-        </w:rPr>
-        <w:t xml:space="preserve">The defects.</w:t>
-      </w:r>
-      <w:r>
-        <w:rPr>
-          <w:rFonts w:ascii="Calibri" w:cs="Calibri" w:eastAsia="Calibri" w:hAnsi="Calibri"/>
-          <w:color w:val="262E33"/>
-          <w:sz w:val="21"/>
-          <w:szCs w:val="21"/>
-        </w:rPr>
-        <w:t xml:space="preserve"> Optional: paste the End of Days, Restrictions and Performance Defects out of </w:t>
-      </w:r>
-      <w:r>
-        <w:rPr>
-          <w:rFonts w:ascii="Calibri" w:cs="Calibri" w:eastAsia="Calibri" w:hAnsi="Calibri"/>
-          <w:b/>
-          <w:bCs/>
-          <w:color w:val="262E33"/>
-          <w:sz w:val="21"/>
-          <w:szCs w:val="21"/>
-        </w:rPr>
-        <w:t xml:space="preserve">Equinox or EMS</w:t>
-      </w:r>
-      <w:r>
-        <w:rPr>
-          <w:rFonts w:ascii="Calibri" w:cs="Calibri" w:eastAsia="Calibri" w:hAnsi="Calibri"/>
-          <w:color w:val="262E33"/>
-          <w:sz w:val="21"/>
-          <w:szCs w:val="21"/>
-        </w:rPr>
-        <w:t xml:space="preserve"> into the </w:t>
-      </w:r>
-      <w:r>
-        <w:rPr>
-          <w:rFonts w:ascii="Calibri" w:cs="Calibri" w:eastAsia="Calibri" w:hAnsi="Calibri"/>
-          <w:b/>
-          <w:bCs/>
-          <w:color w:val="262E33"/>
-          <w:sz w:val="21"/>
-          <w:szCs w:val="21"/>
-        </w:rPr>
-        <w:t xml:space="preserve">Defects</w:t>
-      </w:r>
-      <w:r>
-        <w:rPr>
-          <w:rFonts w:ascii="Calibri" w:cs="Calibri" w:eastAsia="Calibri" w:hAnsi="Calibri"/>
-          <w:color w:val="262E33"/>
-          <w:sz w:val="21"/>
-          <w:szCs w:val="21"/>
-        </w:rPr>
-        <w:t xml:space="preserve"> box, just as they come.</w:t>
-      </w:r>
-    </w:p>
-    <w:p>
-      <w:pPr>
-        <w:pStyle w:val="ListParagraph"/>
-        <w:numPr>
-          <w:ilvl w:val="0"/>
-          <w:numId w:val="22"/>
-        </w:numPr>
-        <w:spacing w:after="110" w:line="276" w:lineRule="auto"/>
-      </w:pPr>
-      <w:r>
-        <w:rPr>
-          <w:rFonts w:ascii="Calibri" w:cs="Calibri" w:eastAsia="Calibri" w:hAnsi="Calibri"/>
-          <w:b/>
-          <w:bCs/>
-          <w:color w:val="262E33"/>
-          <w:sz w:val="21"/>
-          <w:szCs w:val="21"/>
-        </w:rPr>
-        <w:t xml:space="preserve">Press Read the plan.</w:t>
-      </w:r>
-      <w:r>
-        <w:rPr>
-          <w:rFonts w:ascii="Calibri" w:cs="Calibri" w:eastAsia="Calibri" w:hAnsi="Calibri"/>
-          <w:color w:val="262E33"/>
-          <w:sz w:val="21"/>
-          <w:szCs w:val="21"/>
-        </w:rPr>
-        <w:t xml:space="preserve"> The plan comes back below in its own shape, with a suggestion in each Action column — in bold where it differs from what the plan had — and a </w:t>
-      </w:r>
-      <w:r>
-        <w:rPr>
-          <w:rFonts w:ascii="Calibri" w:cs="Calibri" w:eastAsia="Calibri" w:hAnsi="Calibri"/>
-          <w:b/>
-          <w:bCs/>
-          <w:color w:val="262E33"/>
-          <w:sz w:val="21"/>
-          <w:szCs w:val="21"/>
-        </w:rPr>
-        <w:t xml:space="preserve">Why</w:t>
-      </w:r>
-      <w:r>
-        <w:rPr>
-          <w:rFonts w:ascii="Calibri" w:cs="Calibri" w:eastAsia="Calibri" w:hAnsi="Calibri"/>
-          <w:color w:val="262E33"/>
-          <w:sz w:val="21"/>
-          <w:szCs w:val="21"/>
-        </w:rPr>
-        <w:t xml:space="preserve"> column saying what the plan had, the reasons, and where the unit is today.</w:t>
-      </w:r>
-    </w:p>
-    <w:p>
-      <w:pPr>
-        <w:spacing w:after="140" w:line="276" w:lineRule="auto"/>
-      </w:pPr>
-      <w:r>
-        <w:rPr>
-          <w:rFonts w:ascii="Calibri" w:cs="Calibri" w:eastAsia="Calibri" w:hAnsi="Calibri"/>
-          <w:color w:val="262E33"/>
-          <w:sz w:val="21"/>
-          <w:szCs w:val="21"/>
-        </w:rPr>
-        <w:t xml:space="preserve">Two more boxes, and two ticks:</w:t>
       </w:r>
     </w:p>
     <w:p>
@@ -11860,16 +12039,56 @@
           <w:sz w:val="21"/>
           <w:szCs w:val="21"/>
         </w:rPr>
-        <w:t xml:space="preserve">Out of service</w:t>
-      </w:r>
-      <w:r>
-        <w:rPr>
-          <w:rFonts w:ascii="Calibri" w:cs="Calibri" w:eastAsia="Calibri" w:hAnsi="Calibri"/>
-          <w:color w:val="262E33"/>
-          <w:sz w:val="21"/>
-          <w:szCs w:val="21"/>
-        </w:rPr>
-        <w:t xml:space="preserve"> — units to ignore. Their lines are marked and left out.</w:t>
+        <w:t xml:space="preserve">The plan.</w:t>
+      </w:r>
+      <w:r>
+        <w:rPr>
+          <w:rFonts w:ascii="Calibri" w:cs="Calibri" w:eastAsia="Calibri" w:hAnsi="Calibri"/>
+          <w:color w:val="262E33"/>
+          <w:sz w:val="21"/>
+          <w:szCs w:val="21"/>
+        </w:rPr>
+        <w:t xml:space="preserve"> Copy the </w:t>
+      </w:r>
+      <w:r>
+        <w:rPr>
+          <w:rFonts w:ascii="Calibri" w:cs="Calibri" w:eastAsia="Calibri" w:hAnsi="Calibri"/>
+          <w:b/>
+          <w:bCs/>
+          <w:color w:val="262E33"/>
+          <w:sz w:val="21"/>
+          <w:szCs w:val="21"/>
+        </w:rPr>
+        <w:t xml:space="preserve">Maintenance Plan</w:t>
+      </w:r>
+      <w:r>
+        <w:rPr>
+          <w:rFonts w:ascii="Calibri" w:cs="Calibri" w:eastAsia="Calibri" w:hAnsi="Calibri"/>
+          <w:color w:val="262E33"/>
+          <w:sz w:val="21"/>
+          <w:szCs w:val="21"/>
+        </w:rPr>
+        <w:t xml:space="preserve"> tab out of the Mainline Stock Control Document, or the Metro Stock Telex, and paste it into the </w:t>
+      </w:r>
+      <w:r>
+        <w:rPr>
+          <w:rFonts w:ascii="Calibri" w:cs="Calibri" w:eastAsia="Calibri" w:hAnsi="Calibri"/>
+          <w:b/>
+          <w:bCs/>
+          <w:color w:val="262E33"/>
+          <w:sz w:val="21"/>
+          <w:szCs w:val="21"/>
+        </w:rPr>
+        <w:t xml:space="preserve">Maintenance plan</w:t>
+      </w:r>
+      <w:r>
+        <w:rPr>
+          <w:rFonts w:ascii="Calibri" w:cs="Calibri" w:eastAsia="Calibri" w:hAnsi="Calibri"/>
+          <w:color w:val="262E33"/>
+          <w:sz w:val="21"/>
+          <w:szCs w:val="21"/>
+        </w:rPr>
+        <w:t xml:space="preserve"> box.</w:t>
       </w:r>
     </w:p>
     <w:p>
@@ -11890,36 +12109,56 @@
           <w:sz w:val="21"/>
           <w:szCs w:val="21"/>
         </w:rPr>
-        <w:t xml:space="preserve">MSE attending</w:t>
-      </w:r>
-      <w:r>
-        <w:rPr>
-          <w:rFonts w:ascii="Calibri" w:cs="Calibri" w:eastAsia="Calibri" w:hAnsi="Calibri"/>
-          <w:color w:val="262E33"/>
-          <w:sz w:val="21"/>
-          <w:szCs w:val="21"/>
-        </w:rPr>
-        <w:t xml:space="preserve"> — units the mobile engineers are going out to. Their lines get </w:t>
-      </w:r>
-      <w:r>
-        <w:rPr>
-          <w:rFonts w:ascii="Calibri" w:cs="Calibri" w:eastAsia="Calibri" w:hAnsi="Calibri"/>
-          <w:i/>
-          <w:iCs/>
-          <w:color w:val="262E33"/>
-          <w:sz w:val="21"/>
-          <w:szCs w:val="21"/>
-        </w:rPr>
-        <w:t xml:space="preserve">MSE ATTENDING — NO REQUEST</w:t>
-      </w:r>
-      <w:r>
-        <w:rPr>
-          <w:rFonts w:ascii="Calibri" w:cs="Calibri" w:eastAsia="Calibri" w:hAnsi="Calibri"/>
-          <w:color w:val="262E33"/>
-          <w:sz w:val="21"/>
-          <w:szCs w:val="21"/>
-        </w:rPr>
-        <w:t xml:space="preserve">. The units the defects export flags MSE are listed under the box once the plan is read.</w:t>
+        <w:t xml:space="preserve">The defects.</w:t>
+      </w:r>
+      <w:r>
+        <w:rPr>
+          <w:rFonts w:ascii="Calibri" w:cs="Calibri" w:eastAsia="Calibri" w:hAnsi="Calibri"/>
+          <w:color w:val="262E33"/>
+          <w:sz w:val="21"/>
+          <w:szCs w:val="21"/>
+        </w:rPr>
+        <w:t xml:space="preserve"> Optional: paste the End of Days, Restrictions and Performance Defects out of </w:t>
+      </w:r>
+      <w:r>
+        <w:rPr>
+          <w:rFonts w:ascii="Calibri" w:cs="Calibri" w:eastAsia="Calibri" w:hAnsi="Calibri"/>
+          <w:b/>
+          <w:bCs/>
+          <w:color w:val="262E33"/>
+          <w:sz w:val="21"/>
+          <w:szCs w:val="21"/>
+        </w:rPr>
+        <w:t xml:space="preserve">Equinox or EMS</w:t>
+      </w:r>
+      <w:r>
+        <w:rPr>
+          <w:rFonts w:ascii="Calibri" w:cs="Calibri" w:eastAsia="Calibri" w:hAnsi="Calibri"/>
+          <w:color w:val="262E33"/>
+          <w:sz w:val="21"/>
+          <w:szCs w:val="21"/>
+        </w:rPr>
+        <w:t xml:space="preserve"> into the </w:t>
+      </w:r>
+      <w:r>
+        <w:rPr>
+          <w:rFonts w:ascii="Calibri" w:cs="Calibri" w:eastAsia="Calibri" w:hAnsi="Calibri"/>
+          <w:b/>
+          <w:bCs/>
+          <w:color w:val="262E33"/>
+          <w:sz w:val="21"/>
+          <w:szCs w:val="21"/>
+        </w:rPr>
+        <w:t xml:space="preserve">Defects</w:t>
+      </w:r>
+      <w:r>
+        <w:rPr>
+          <w:rFonts w:ascii="Calibri" w:cs="Calibri" w:eastAsia="Calibri" w:hAnsi="Calibri"/>
+          <w:color w:val="262E33"/>
+          <w:sz w:val="21"/>
+          <w:szCs w:val="21"/>
+        </w:rPr>
+        <w:t xml:space="preserve"> box, just as they come.</w:t>
       </w:r>
     </w:p>
     <w:p>
@@ -11940,46 +12179,36 @@
           <w:sz w:val="21"/>
           <w:szCs w:val="21"/>
         </w:rPr>
-        <w:t xml:space="preserve">Keep trains together</w:t>
-      </w:r>
-      <w:r>
-        <w:rPr>
-          <w:rFonts w:ascii="Calibri" w:cs="Calibri" w:eastAsia="Calibri" w:hAnsi="Calibri"/>
-          <w:color w:val="262E33"/>
-          <w:sz w:val="21"/>
-          <w:szCs w:val="21"/>
-        </w:rPr>
-        <w:t xml:space="preserve"> — splits a formation only where nothing else gets the unit home.</w:t>
-      </w:r>
-    </w:p>
-    <w:p>
-      <w:pPr>
-        <w:pStyle w:val="ListParagraph"/>
-        <w:numPr>
-          <w:ilvl w:val="0"/>
-          <w:numId w:val="23"/>
-        </w:numPr>
-        <w:spacing w:after="110" w:line="276" w:lineRule="auto"/>
-      </w:pPr>
-      <w:r>
-        <w:rPr>
-          <w:rFonts w:ascii="Calibri" w:cs="Calibri" w:eastAsia="Calibri" w:hAnsi="Calibri"/>
-          <w:b/>
-          <w:bCs/>
-          <w:color w:val="262E33"/>
-          <w:sz w:val="21"/>
-          <w:szCs w:val="21"/>
-        </w:rPr>
-        <w:t xml:space="preserve">The day hasn't run yet</w:t>
-      </w:r>
-      <w:r>
-        <w:rPr>
-          <w:rFonts w:ascii="Calibri" w:cs="Calibri" w:eastAsia="Calibri" w:hAnsi="Calibri"/>
-          <w:color w:val="262E33"/>
-          <w:sz w:val="21"/>
-          <w:szCs w:val="21"/>
-        </w:rPr>
-        <w:t xml:space="preserve"> — each unit is taken from where its first working starts, so the request is made before it goes out. It is ticked for you when the reports are for today or later.</w:t>
+        <w:t xml:space="preserve">Press Read the plan.</w:t>
+      </w:r>
+      <w:r>
+        <w:rPr>
+          <w:rFonts w:ascii="Calibri" w:cs="Calibri" w:eastAsia="Calibri" w:hAnsi="Calibri"/>
+          <w:color w:val="262E33"/>
+          <w:sz w:val="21"/>
+          <w:szCs w:val="21"/>
+        </w:rPr>
+        <w:t xml:space="preserve"> The plan comes back below in its own shape, with a suggestion in each Action column — in bold where it differs from what the plan had — and a </w:t>
+      </w:r>
+      <w:r>
+        <w:rPr>
+          <w:rFonts w:ascii="Calibri" w:cs="Calibri" w:eastAsia="Calibri" w:hAnsi="Calibri"/>
+          <w:b/>
+          <w:bCs/>
+          <w:color w:val="262E33"/>
+          <w:sz w:val="21"/>
+          <w:szCs w:val="21"/>
+        </w:rPr>
+        <w:t xml:space="preserve">Why</w:t>
+      </w:r>
+      <w:r>
+        <w:rPr>
+          <w:rFonts w:ascii="Calibri" w:cs="Calibri" w:eastAsia="Calibri" w:hAnsi="Calibri"/>
+          <w:color w:val="262E33"/>
+          <w:sz w:val="21"/>
+          <w:szCs w:val="21"/>
+        </w:rPr>
+        <w:t xml:space="preserve"> column saying what the plan had, the reasons, and where the unit is today.</w:t>
       </w:r>
     </w:p>
     <w:p>
@@ -11989,62 +12218,11 @@
       <w:r>
         <w:rPr>
           <w:rFonts w:ascii="Calibri" w:cs="Calibri" w:eastAsia="Calibri" w:hAnsi="Calibri"/>
-          <w:b/>
-          <w:bCs/>
-          <w:color w:val="262E33"/>
-          <w:sz w:val="21"/>
-          <w:szCs w:val="21"/>
-        </w:rPr>
-        <w:t xml:space="preserve">Workbook</w:t>
-      </w:r>
-      <w:r>
-        <w:rPr>
-          <w:rFonts w:ascii="Calibri" w:cs="Calibri" w:eastAsia="Calibri" w:hAnsi="Calibri"/>
-          <w:color w:val="262E33"/>
-          <w:sz w:val="21"/>
-          <w:szCs w:val="21"/>
-        </w:rPr>
-        <w:t xml:space="preserve"> says which plan was pasted — it is read from the paste, or pick </w:t>
-      </w:r>
-      <w:r>
-        <w:rPr>
-          <w:rFonts w:ascii="Calibri" w:cs="Calibri" w:eastAsia="Calibri" w:hAnsi="Calibri"/>
-          <w:b/>
-          <w:bCs/>
-          <w:color w:val="262E33"/>
-          <w:sz w:val="21"/>
-          <w:szCs w:val="21"/>
-        </w:rPr>
-        <w:t xml:space="preserve">Mainline plan</w:t>
-      </w:r>
-      <w:r>
-        <w:rPr>
-          <w:rFonts w:ascii="Calibri" w:cs="Calibri" w:eastAsia="Calibri" w:hAnsi="Calibri"/>
-          <w:color w:val="262E33"/>
-          <w:sz w:val="21"/>
-          <w:szCs w:val="21"/>
-        </w:rPr>
-        <w:t xml:space="preserve"> or </w:t>
-      </w:r>
-      <w:r>
-        <w:rPr>
-          <w:rFonts w:ascii="Calibri" w:cs="Calibri" w:eastAsia="Calibri" w:hAnsi="Calibri"/>
-          <w:b/>
-          <w:bCs/>
-          <w:color w:val="262E33"/>
-          <w:sz w:val="21"/>
-          <w:szCs w:val="21"/>
-        </w:rPr>
-        <w:t xml:space="preserve">Metro Telex</w:t>
-      </w:r>
-      <w:r>
-        <w:rPr>
-          <w:rFonts w:ascii="Calibri" w:cs="Calibri" w:eastAsia="Calibri" w:hAnsi="Calibri"/>
-          <w:color w:val="262E33"/>
-          <w:sz w:val="21"/>
-          <w:szCs w:val="21"/>
-        </w:rPr>
-        <w:t xml:space="preserve">. Then:</w:t>
+          <w:color w:val="262E33"/>
+          <w:sz w:val="21"/>
+          <w:szCs w:val="21"/>
+        </w:rPr>
+        <w:t xml:space="preserve">Two more boxes, and two ticks:</w:t>
       </w:r>
     </w:p>
     <w:p>
@@ -12065,16 +12243,16 @@
           <w:sz w:val="21"/>
           <w:szCs w:val="21"/>
         </w:rPr>
-        <w:t xml:space="preserve">Copy the plan back</w:t>
-      </w:r>
-      <w:r>
-        <w:rPr>
-          <w:rFonts w:ascii="Calibri" w:cs="Calibri" w:eastAsia="Calibri" w:hAnsi="Calibri"/>
-          <w:color w:val="262E33"/>
-          <w:sz w:val="21"/>
-          <w:szCs w:val="21"/>
-        </w:rPr>
-        <w:t xml:space="preserve"> — paste it over the Maintenance Plan tab from A1; the Action column lands where it was.</w:t>
+        <w:t xml:space="preserve">Out of service</w:t>
+      </w:r>
+      <w:r>
+        <w:rPr>
+          <w:rFonts w:ascii="Calibri" w:cs="Calibri" w:eastAsia="Calibri" w:hAnsi="Calibri"/>
+          <w:color w:val="262E33"/>
+          <w:sz w:val="21"/>
+          <w:szCs w:val="21"/>
+        </w:rPr>
+        <w:t xml:space="preserve"> — units to ignore. Their lines are marked and left out.</w:t>
       </w:r>
     </w:p>
     <w:p>
@@ -12095,36 +12273,36 @@
           <w:sz w:val="21"/>
           <w:szCs w:val="21"/>
         </w:rPr>
-        <w:t xml:space="preserve">Save as Excel</w:t>
-      </w:r>
-      <w:r>
-        <w:rPr>
-          <w:rFonts w:ascii="Calibri" w:cs="Calibri" w:eastAsia="Calibri" w:hAnsi="Calibri"/>
-          <w:color w:val="262E33"/>
-          <w:sz w:val="21"/>
-          <w:szCs w:val="21"/>
-        </w:rPr>
-        <w:t xml:space="preserve"> — the same sheet, with a </w:t>
-      </w:r>
-      <w:r>
-        <w:rPr>
-          <w:rFonts w:ascii="Calibri" w:cs="Calibri" w:eastAsia="Calibri" w:hAnsi="Calibri"/>
-          <w:b/>
-          <w:bCs/>
-          <w:color w:val="262E33"/>
-          <w:sz w:val="21"/>
-          <w:szCs w:val="21"/>
-        </w:rPr>
-        <w:t xml:space="preserve">Why</w:t>
-      </w:r>
-      <w:r>
-        <w:rPr>
-          <w:rFonts w:ascii="Calibri" w:cs="Calibri" w:eastAsia="Calibri" w:hAnsi="Calibri"/>
-          <w:color w:val="262E33"/>
-          <w:sz w:val="21"/>
-          <w:szCs w:val="21"/>
-        </w:rPr>
-        <w:t xml:space="preserve"> sheet beside it.</w:t>
+        <w:t xml:space="preserve">MSE attending</w:t>
+      </w:r>
+      <w:r>
+        <w:rPr>
+          <w:rFonts w:ascii="Calibri" w:cs="Calibri" w:eastAsia="Calibri" w:hAnsi="Calibri"/>
+          <w:color w:val="262E33"/>
+          <w:sz w:val="21"/>
+          <w:szCs w:val="21"/>
+        </w:rPr>
+        <w:t xml:space="preserve"> — units the mobile engineers are going out to. Their lines get </w:t>
+      </w:r>
+      <w:r>
+        <w:rPr>
+          <w:rFonts w:ascii="Calibri" w:cs="Calibri" w:eastAsia="Calibri" w:hAnsi="Calibri"/>
+          <w:i/>
+          <w:iCs/>
+          <w:color w:val="262E33"/>
+          <w:sz w:val="21"/>
+          <w:szCs w:val="21"/>
+        </w:rPr>
+        <w:t xml:space="preserve">MSE ATTENDING — NO REQUEST</w:t>
+      </w:r>
+      <w:r>
+        <w:rPr>
+          <w:rFonts w:ascii="Calibri" w:cs="Calibri" w:eastAsia="Calibri" w:hAnsi="Calibri"/>
+          <w:color w:val="262E33"/>
+          <w:sz w:val="21"/>
+          <w:szCs w:val="21"/>
+        </w:rPr>
+        <w:t xml:space="preserve">. The units the defects export flags MSE are listed under the box once the plan is read.</w:t>
       </w:r>
     </w:p>
     <w:p>
@@ -12133,6 +12311,211 @@
         <w:numPr>
           <w:ilvl w:val="0"/>
           <w:numId w:val="24"/>
+        </w:numPr>
+        <w:spacing w:after="110" w:line="276" w:lineRule="auto"/>
+      </w:pPr>
+      <w:r>
+        <w:rPr>
+          <w:rFonts w:ascii="Calibri" w:cs="Calibri" w:eastAsia="Calibri" w:hAnsi="Calibri"/>
+          <w:b/>
+          <w:bCs/>
+          <w:color w:val="262E33"/>
+          <w:sz w:val="21"/>
+          <w:szCs w:val="21"/>
+        </w:rPr>
+        <w:t xml:space="preserve">Keep trains together</w:t>
+      </w:r>
+      <w:r>
+        <w:rPr>
+          <w:rFonts w:ascii="Calibri" w:cs="Calibri" w:eastAsia="Calibri" w:hAnsi="Calibri"/>
+          <w:color w:val="262E33"/>
+          <w:sz w:val="21"/>
+          <w:szCs w:val="21"/>
+        </w:rPr>
+        <w:t xml:space="preserve"> — splits a formation only where nothing else gets the unit home.</w:t>
+      </w:r>
+    </w:p>
+    <w:p>
+      <w:pPr>
+        <w:pStyle w:val="ListParagraph"/>
+        <w:numPr>
+          <w:ilvl w:val="0"/>
+          <w:numId w:val="24"/>
+        </w:numPr>
+        <w:spacing w:after="110" w:line="276" w:lineRule="auto"/>
+      </w:pPr>
+      <w:r>
+        <w:rPr>
+          <w:rFonts w:ascii="Calibri" w:cs="Calibri" w:eastAsia="Calibri" w:hAnsi="Calibri"/>
+          <w:b/>
+          <w:bCs/>
+          <w:color w:val="262E33"/>
+          <w:sz w:val="21"/>
+          <w:szCs w:val="21"/>
+        </w:rPr>
+        <w:t xml:space="preserve">The day hasn't run yet</w:t>
+      </w:r>
+      <w:r>
+        <w:rPr>
+          <w:rFonts w:ascii="Calibri" w:cs="Calibri" w:eastAsia="Calibri" w:hAnsi="Calibri"/>
+          <w:color w:val="262E33"/>
+          <w:sz w:val="21"/>
+          <w:szCs w:val="21"/>
+        </w:rPr>
+        <w:t xml:space="preserve"> — each unit is taken from where its first working starts, so the request is made before it goes out. It is ticked for you when the reports are for today or later.</w:t>
+      </w:r>
+    </w:p>
+    <w:p>
+      <w:pPr>
+        <w:spacing w:after="140" w:line="276" w:lineRule="auto"/>
+      </w:pPr>
+      <w:r>
+        <w:rPr>
+          <w:rFonts w:ascii="Calibri" w:cs="Calibri" w:eastAsia="Calibri" w:hAnsi="Calibri"/>
+          <w:b/>
+          <w:bCs/>
+          <w:color w:val="262E33"/>
+          <w:sz w:val="21"/>
+          <w:szCs w:val="21"/>
+        </w:rPr>
+        <w:t xml:space="preserve">Workbook</w:t>
+      </w:r>
+      <w:r>
+        <w:rPr>
+          <w:rFonts w:ascii="Calibri" w:cs="Calibri" w:eastAsia="Calibri" w:hAnsi="Calibri"/>
+          <w:color w:val="262E33"/>
+          <w:sz w:val="21"/>
+          <w:szCs w:val="21"/>
+        </w:rPr>
+        <w:t xml:space="preserve"> says which plan was pasted — it is read from the paste, or pick </w:t>
+      </w:r>
+      <w:r>
+        <w:rPr>
+          <w:rFonts w:ascii="Calibri" w:cs="Calibri" w:eastAsia="Calibri" w:hAnsi="Calibri"/>
+          <w:b/>
+          <w:bCs/>
+          <w:color w:val="262E33"/>
+          <w:sz w:val="21"/>
+          <w:szCs w:val="21"/>
+        </w:rPr>
+        <w:t xml:space="preserve">Mainline plan</w:t>
+      </w:r>
+      <w:r>
+        <w:rPr>
+          <w:rFonts w:ascii="Calibri" w:cs="Calibri" w:eastAsia="Calibri" w:hAnsi="Calibri"/>
+          <w:color w:val="262E33"/>
+          <w:sz w:val="21"/>
+          <w:szCs w:val="21"/>
+        </w:rPr>
+        <w:t xml:space="preserve"> or </w:t>
+      </w:r>
+      <w:r>
+        <w:rPr>
+          <w:rFonts w:ascii="Calibri" w:cs="Calibri" w:eastAsia="Calibri" w:hAnsi="Calibri"/>
+          <w:b/>
+          <w:bCs/>
+          <w:color w:val="262E33"/>
+          <w:sz w:val="21"/>
+          <w:szCs w:val="21"/>
+        </w:rPr>
+        <w:t xml:space="preserve">Metro Telex</w:t>
+      </w:r>
+      <w:r>
+        <w:rPr>
+          <w:rFonts w:ascii="Calibri" w:cs="Calibri" w:eastAsia="Calibri" w:hAnsi="Calibri"/>
+          <w:color w:val="262E33"/>
+          <w:sz w:val="21"/>
+          <w:szCs w:val="21"/>
+        </w:rPr>
+        <w:t xml:space="preserve">. Then:</w:t>
+      </w:r>
+    </w:p>
+    <w:p>
+      <w:pPr>
+        <w:pStyle w:val="ListParagraph"/>
+        <w:numPr>
+          <w:ilvl w:val="0"/>
+          <w:numId w:val="25"/>
+        </w:numPr>
+        <w:spacing w:after="110" w:line="276" w:lineRule="auto"/>
+      </w:pPr>
+      <w:r>
+        <w:rPr>
+          <w:rFonts w:ascii="Calibri" w:cs="Calibri" w:eastAsia="Calibri" w:hAnsi="Calibri"/>
+          <w:b/>
+          <w:bCs/>
+          <w:color w:val="262E33"/>
+          <w:sz w:val="21"/>
+          <w:szCs w:val="21"/>
+        </w:rPr>
+        <w:t xml:space="preserve">Copy the plan back</w:t>
+      </w:r>
+      <w:r>
+        <w:rPr>
+          <w:rFonts w:ascii="Calibri" w:cs="Calibri" w:eastAsia="Calibri" w:hAnsi="Calibri"/>
+          <w:color w:val="262E33"/>
+          <w:sz w:val="21"/>
+          <w:szCs w:val="21"/>
+        </w:rPr>
+        <w:t xml:space="preserve"> — paste it over the Maintenance Plan tab from A1; the Action column lands where it was.</w:t>
+      </w:r>
+    </w:p>
+    <w:p>
+      <w:pPr>
+        <w:pStyle w:val="ListParagraph"/>
+        <w:numPr>
+          <w:ilvl w:val="0"/>
+          <w:numId w:val="25"/>
+        </w:numPr>
+        <w:spacing w:after="110" w:line="276" w:lineRule="auto"/>
+      </w:pPr>
+      <w:r>
+        <w:rPr>
+          <w:rFonts w:ascii="Calibri" w:cs="Calibri" w:eastAsia="Calibri" w:hAnsi="Calibri"/>
+          <w:b/>
+          <w:bCs/>
+          <w:color w:val="262E33"/>
+          <w:sz w:val="21"/>
+          <w:szCs w:val="21"/>
+        </w:rPr>
+        <w:t xml:space="preserve">Save as Excel</w:t>
+      </w:r>
+      <w:r>
+        <w:rPr>
+          <w:rFonts w:ascii="Calibri" w:cs="Calibri" w:eastAsia="Calibri" w:hAnsi="Calibri"/>
+          <w:color w:val="262E33"/>
+          <w:sz w:val="21"/>
+          <w:szCs w:val="21"/>
+        </w:rPr>
+        <w:t xml:space="preserve"> — the same sheet, with a </w:t>
+      </w:r>
+      <w:r>
+        <w:rPr>
+          <w:rFonts w:ascii="Calibri" w:cs="Calibri" w:eastAsia="Calibri" w:hAnsi="Calibri"/>
+          <w:b/>
+          <w:bCs/>
+          <w:color w:val="262E33"/>
+          <w:sz w:val="21"/>
+          <w:szCs w:val="21"/>
+        </w:rPr>
+        <w:t xml:space="preserve">Why</w:t>
+      </w:r>
+      <w:r>
+        <w:rPr>
+          <w:rFonts w:ascii="Calibri" w:cs="Calibri" w:eastAsia="Calibri" w:hAnsi="Calibri"/>
+          <w:color w:val="262E33"/>
+          <w:sz w:val="21"/>
+          <w:szCs w:val="21"/>
+        </w:rPr>
+        <w:t xml:space="preserve"> sheet beside it.</w:t>
+      </w:r>
+    </w:p>
+    <w:p>
+      <w:pPr>
+        <w:pStyle w:val="ListParagraph"/>
+        <w:numPr>
+          <w:ilvl w:val="0"/>
+          <w:numId w:val="25"/>
         </w:numPr>
         <w:spacing w:after="110" w:line="276" w:lineRule="auto"/>
       </w:pPr>
@@ -14175,7 +14558,7 @@
         <w:pStyle w:val="ListParagraph"/>
         <w:numPr>
           <w:ilvl w:val="0"/>
-          <w:numId w:val="25"/>
+          <w:numId w:val="26"/>
         </w:numPr>
         <w:spacing w:after="110" w:line="276" w:lineRule="auto"/>
       </w:pPr>
@@ -14205,7 +14588,7 @@
         <w:pStyle w:val="ListParagraph"/>
         <w:numPr>
           <w:ilvl w:val="0"/>
-          <w:numId w:val="25"/>
+          <w:numId w:val="26"/>
         </w:numPr>
         <w:spacing w:after="110" w:line="276" w:lineRule="auto"/>
       </w:pPr>
@@ -14235,7 +14618,7 @@
         <w:pStyle w:val="ListParagraph"/>
         <w:numPr>
           <w:ilvl w:val="0"/>
-          <w:numId w:val="25"/>
+          <w:numId w:val="26"/>
         </w:numPr>
         <w:spacing w:after="110" w:line="276" w:lineRule="auto"/>
       </w:pPr>
@@ -14265,7 +14648,7 @@
         <w:pStyle w:val="ListParagraph"/>
         <w:numPr>
           <w:ilvl w:val="0"/>
-          <w:numId w:val="25"/>
+          <w:numId w:val="26"/>
         </w:numPr>
         <w:spacing w:after="110" w:line="276" w:lineRule="auto"/>
       </w:pPr>
@@ -14348,7 +14731,7 @@
         <w:pStyle w:val="ListParagraph"/>
         <w:numPr>
           <w:ilvl w:val="0"/>
-          <w:numId w:val="26"/>
+          <w:numId w:val="27"/>
         </w:numPr>
         <w:spacing w:after="110" w:line="276" w:lineRule="auto"/>
       </w:pPr>
@@ -14378,7 +14761,7 @@
         <w:pStyle w:val="ListParagraph"/>
         <w:numPr>
           <w:ilvl w:val="0"/>
-          <w:numId w:val="26"/>
+          <w:numId w:val="27"/>
         </w:numPr>
         <w:spacing w:after="110" w:line="276" w:lineRule="auto"/>
       </w:pPr>
@@ -14428,7 +14811,7 @@
         <w:pStyle w:val="ListParagraph"/>
         <w:numPr>
           <w:ilvl w:val="0"/>
-          <w:numId w:val="26"/>
+          <w:numId w:val="27"/>
         </w:numPr>
         <w:spacing w:after="110" w:line="276" w:lineRule="auto"/>
       </w:pPr>
@@ -14538,7 +14921,7 @@
         <w:pStyle w:val="ListParagraph"/>
         <w:numPr>
           <w:ilvl w:val="0"/>
-          <w:numId w:val="26"/>
+          <w:numId w:val="27"/>
         </w:numPr>
         <w:spacing w:after="110" w:line="276" w:lineRule="auto"/>
       </w:pPr>
@@ -15794,13 +16177,13 @@
     </w:lvlOverride>
   </w:num>
   <w:num w:numId="22">
-    <w:abstractNumId w:val="2"/>
+    <w:abstractNumId w:val="3"/>
     <w:lvlOverride w:ilvl="0">
       <w:startOverride w:val="1"/>
     </w:lvlOverride>
   </w:num>
   <w:num w:numId="23">
-    <w:abstractNumId w:val="3"/>
+    <w:abstractNumId w:val="2"/>
     <w:lvlOverride w:ilvl="0">
       <w:startOverride w:val="1"/>
     </w:lvlOverride>
@@ -15818,6 +16201,12 @@
     </w:lvlOverride>
   </w:num>
   <w:num w:numId="26">
+    <w:abstractNumId w:val="3"/>
+    <w:lvlOverride w:ilvl="0">
+      <w:startOverride w:val="1"/>
+    </w:lvlOverride>
+  </w:num>
+  <w:num w:numId="27">
     <w:abstractNumId w:val="2"/>
     <w:lvlOverride w:ilvl="0">
       <w:startOverride w:val="1"/>

</xml_diff>

<commit_message>
Shortages: option to leave off swaps that cancel out
A 375/9 on a 375 diagram and a 375 on a 375/9 diagram ending on the same
working (RM047 and RM913 on the 1G87) are one train with the units the other
way round. Both halves are still listed by default, because the swap has to
be undone; the new "Leave off swaps that cancel out" option leaves the pair
off, paired one for one in diagram order, and the status line says how many
went. The README had said such swaps cancel; it now says what happens.

Co-Authored-By: Claude Opus 5.5 <noreply@anthropic.com>
Claude-Session: https://claude.ai/code/session_01Bo8y3CPA6i1JGS4N3h4DXr
</commit_message>
<xml_diff>
--- a/HOW TO USE.docx
+++ b/HOW TO USE.docx
@@ -11302,6 +11302,36 @@
           <w:szCs w:val="21"/>
         </w:rPr>
         <w:t xml:space="preserve"> only for workings that end at Ramsgate.</w:t>
+      </w:r>
+    </w:p>
+    <w:p>
+      <w:pPr>
+        <w:pStyle w:val="ListParagraph"/>
+        <w:numPr>
+          <w:ilvl w:val="0"/>
+          <w:numId w:val="21"/>
+        </w:numPr>
+        <w:spacing w:after="110" w:line="276" w:lineRule="auto"/>
+      </w:pPr>
+      <w:r>
+        <w:rPr>
+          <w:rFonts w:ascii="Calibri" w:cs="Calibri" w:eastAsia="Calibri" w:hAnsi="Calibri"/>
+          <w:b/>
+          <w:bCs/>
+          <w:color w:val="262E33"/>
+          <w:sz w:val="21"/>
+          <w:szCs w:val="21"/>
+        </w:rPr>
+        <w:t xml:space="preserve">Leave off swaps that cancel out</w:t>
+      </w:r>
+      <w:r>
+        <w:rPr>
+          <w:rFonts w:ascii="Calibri" w:cs="Calibri" w:eastAsia="Calibri" w:hAnsi="Calibri"/>
+          <w:color w:val="262E33"/>
+          <w:sz w:val="21"/>
+          <w:szCs w:val="21"/>
+        </w:rPr>
+        <w:t xml:space="preserve"> — leaves off a 375/9 on a 375 diagram and a 375 on a 375/9 diagram when both end on the same working, such as RM047 and RM913 on the 1G87 17 11 CST - RAM. It is one train with the two diagrams' units the other way round, so nothing is short. Leave it unticked when the swap still needs undoing. The status line says how many pairs were left off.</w:t>
       </w:r>
     </w:p>
     <w:p>

</xml_diff>

<commit_message>
Weekend: one shunt on a platform no longer makes the station a siding
The 10/11 October weekend sheets listed every departure from Hastings and
Victoria and had nearly every diagram ending VIC. A place marked '#' in the
prints was learned as a berthing place for every diagram, so one unit put
away in a platform turned every call there into a berthing (Week 27
Saturday with one Vic (E) row marked: 82 Mainline lines became 152, 223
cells read VIC). A '#' now makes its own stop a berthing, and a place is
only learned for every diagram if no train leaves it in passenger service;
the Review tab names any '#' it did not learn from. Week 25/27 books are
unchanged.

Files saved from Outlook on a phone under app protection (MSMAMARPCRYPT)
are now named as locked on every panel and in the analyser (1.8.3), rather
than refused as "not the diagram prints".

Co-Authored-By: Claude Opus 5.5 <noreply@anthropic.com>
Claude-Session: https://claude.ai/code/session_01Bo8y3CPA6i1JGS4N3h4DXr
</commit_message>
<xml_diff>
--- a/HOW TO USE.docx
+++ b/HOW TO USE.docx
@@ -13741,6 +13741,159 @@
                 <w:szCs w:val="21"/>
               </w:rPr>
               <w:t xml:space="preserve">A text or CSV save whose columns were lost. Save it again, or paste it from Word.</w:t>
+            </w:r>
+          </w:p>
+        </w:tc>
+      </w:tr>
+      <w:tr>
+        <w:tc>
+          <w:tcPr>
+            <w:tcW w:type="dxa" w:w="4535"/>
+            <w:tcMar>
+              <w:top w:type="dxa" w:w="90"/>
+              <w:left w:type="dxa" w:w="120"/>
+              <w:bottom w:type="dxa" w:w="90"/>
+              <w:right w:type="dxa" w:w="120"/>
+            </w:tcMar>
+          </w:tcPr>
+          <w:p>
+            <w:pPr>
+              <w:spacing w:line="264" w:lineRule="auto"/>
+            </w:pPr>
+            <w:r>
+              <w:rPr>
+                <w:rFonts w:ascii="Calibri" w:cs="Calibri" w:eastAsia="Calibri" w:hAnsi="Calibri"/>
+                <w:i/>
+                <w:iCs/>
+                <w:color w:val="262E33"/>
+                <w:sz w:val="21"/>
+                <w:szCs w:val="21"/>
+              </w:rPr>
+              <w:t xml:space="preserve">"… is locked by your organisation's app protection …"</w:t>
+            </w:r>
+            <w:r>
+              <w:rPr>
+                <w:rFonts w:ascii="Calibri" w:cs="Calibri" w:eastAsia="Calibri" w:hAnsi="Calibri"/>
+                <w:color w:val="262E33"/>
+                <w:sz w:val="21"/>
+                <w:szCs w:val="21"/>
+              </w:rPr>
+              <w:t xml:space="preserve"> (any tab)</w:t>
+            </w:r>
+          </w:p>
+        </w:tc>
+        <w:tc>
+          <w:tcPr>
+            <w:tcW w:type="dxa" w:w="4535"/>
+            <w:tcMar>
+              <w:top w:type="dxa" w:w="90"/>
+              <w:left w:type="dxa" w:w="120"/>
+              <w:bottom w:type="dxa" w:w="90"/>
+              <w:right w:type="dxa" w:w="120"/>
+            </w:tcMar>
+          </w:tcPr>
+          <w:p>
+            <w:pPr>
+              <w:spacing w:line="264" w:lineRule="auto"/>
+            </w:pPr>
+            <w:r>
+              <w:rPr>
+                <w:rFonts w:ascii="Calibri" w:cs="Calibri" w:eastAsia="Calibri" w:hAnsi="Calibri"/>
+                <w:color w:val="262E33"/>
+                <w:sz w:val="21"/>
+                <w:szCs w:val="21"/>
+              </w:rPr>
+              <w:t xml:space="preserve">The file was saved from Outlook or another work app on a phone, and is encrypted so only that phone can open it. Save it from Outlook on the work PC and drop that copy instead.</w:t>
+            </w:r>
+          </w:p>
+        </w:tc>
+      </w:tr>
+      <w:tr>
+        <w:tc>
+          <w:tcPr>
+            <w:tcW w:type="dxa" w:w="4535"/>
+            <w:tcMar>
+              <w:top w:type="dxa" w:w="90"/>
+              <w:left w:type="dxa" w:w="120"/>
+              <w:bottom w:type="dxa" w:w="90"/>
+              <w:right w:type="dxa" w:w="120"/>
+            </w:tcMar>
+          </w:tcPr>
+          <w:p>
+            <w:pPr>
+              <w:spacing w:line="264" w:lineRule="auto"/>
+            </w:pPr>
+            <w:r>
+              <w:rPr>
+                <w:rFonts w:ascii="Calibri" w:cs="Calibri" w:eastAsia="Calibri" w:hAnsi="Calibri"/>
+                <w:color w:val="262E33"/>
+                <w:sz w:val="21"/>
+                <w:szCs w:val="21"/>
+              </w:rPr>
+              <w:t xml:space="preserve">Weekend sheets listing every departure from a station, with nearly every unit ending there</w:t>
+            </w:r>
+          </w:p>
+        </w:tc>
+        <w:tc>
+          <w:tcPr>
+            <w:tcW w:type="dxa" w:w="4535"/>
+            <w:tcMar>
+              <w:top w:type="dxa" w:w="90"/>
+              <w:left w:type="dxa" w:w="120"/>
+              <w:bottom w:type="dxa" w:w="90"/>
+              <w:right w:type="dxa" w:w="120"/>
+            </w:tcMar>
+          </w:tcPr>
+          <w:p>
+            <w:pPr>
+              <w:spacing w:line="264" w:lineRule="auto"/>
+            </w:pPr>
+            <w:r>
+              <w:rPr>
+                <w:rFonts w:ascii="Calibri" w:cs="Calibri" w:eastAsia="Calibri" w:hAnsi="Calibri"/>
+                <w:color w:val="262E33"/>
+                <w:sz w:val="21"/>
+                <w:szCs w:val="21"/>
+              </w:rPr>
+              <w:t xml:space="preserve">Fixed in 3.34.2. A single </w:t>
+            </w:r>
+            <w:r>
+              <w:rPr>
+                <w:rFonts w:ascii="Consolas" w:cs="Consolas" w:eastAsia="Consolas" w:hAnsi="Consolas"/>
+                <w:color w:val="262E33"/>
+                <w:sz w:val="19"/>
+                <w:szCs w:val="19"/>
+              </w:rPr>
+              <w:t xml:space="preserve">#</w:t>
+            </w:r>
+            <w:r>
+              <w:rPr>
+                <w:rFonts w:ascii="Calibri" w:cs="Calibri" w:eastAsia="Calibri" w:hAnsi="Calibri"/>
+                <w:color w:val="262E33"/>
+                <w:sz w:val="21"/>
+                <w:szCs w:val="21"/>
+              </w:rPr>
+              <w:t xml:space="preserve"> (unit put away) on a platform in the prints made that station a siding for every diagram. The Review tab now says </w:t>
+            </w:r>
+            <w:r>
+              <w:rPr>
+                <w:rFonts w:ascii="Calibri" w:cs="Calibri" w:eastAsia="Calibri" w:hAnsi="Calibri"/>
+                <w:i/>
+                <w:iCs/>
+                <w:color w:val="262E33"/>
+                <w:sz w:val="21"/>
+                <w:szCs w:val="21"/>
+              </w:rPr>
+              <w:t xml:space="preserve">"… shunted (#) on … diagrams … only those stops are treated as a berth there"</w:t>
+            </w:r>
+            <w:r>
+              <w:rPr>
+                <w:rFonts w:ascii="Calibri" w:cs="Calibri" w:eastAsia="Calibri" w:hAnsi="Calibri"/>
+                <w:color w:val="262E33"/>
+                <w:sz w:val="21"/>
+                <w:szCs w:val="21"/>
+              </w:rPr>
+              <w:t xml:space="preserve"> when it meets one.</w:t>
             </w:r>
           </w:p>
         </w:tc>

</xml_diff>

<commit_message>
Docs: user guide for 3.34.2
The weekend chapter explains a unit put away (#) in a platform: its own
departure gets a line, every other call there stays a turnround, the Review
tab names it under Notes, and an old copy listing every departure from the
station is the 10/11 October fault. The base-diagrams chapter and the Review
tab list say the same, "Getting the paperwork" warns that files saved on a
phone are locked by app protection, and the troubleshooting rows say which
copy fixes what.

Co-Authored-By: Claude Opus 5.5 <noreply@anthropic.com>
Claude-Session: https://claude.ai/code/session_01Bo8y3CPA6i1JGS4N3h4DXr
</commit_message>
<xml_diff>
--- a/HOW TO USE.docx
+++ b/HOW TO USE.docx
@@ -1747,6 +1747,51 @@
     </w:p>
     <w:p>
       <w:pPr>
+        <w:spacing w:after="140" w:line="276" w:lineRule="auto"/>
+      </w:pPr>
+      <w:r>
+        <w:rPr>
+          <w:rFonts w:ascii="Calibri" w:cs="Calibri" w:eastAsia="Calibri" w:hAnsi="Calibri"/>
+          <w:b/>
+          <w:bCs/>
+          <w:color w:val="262E33"/>
+          <w:sz w:val="21"/>
+          <w:szCs w:val="21"/>
+        </w:rPr>
+        <w:t xml:space="preserve">Save everything on the work PC.</w:t>
+      </w:r>
+      <w:r>
+        <w:rPr>
+          <w:rFonts w:ascii="Calibri" w:cs="Calibri" w:eastAsia="Calibri" w:hAnsi="Calibri"/>
+          <w:color w:val="262E33"/>
+          <w:sz w:val="21"/>
+          <w:szCs w:val="21"/>
+        </w:rPr>
+        <w:t xml:space="preserve"> A file saved from Outlook, or any other work app, on a phone is locked by the organisation's app protection, and only that phone can open it. Drop one on the page and it says </w:t>
+      </w:r>
+      <w:r>
+        <w:rPr>
+          <w:rFonts w:ascii="Calibri" w:cs="Calibri" w:eastAsia="Calibri" w:hAnsi="Calibri"/>
+          <w:i/>
+          <w:iCs/>
+          <w:color w:val="262E33"/>
+          <w:sz w:val="21"/>
+          <w:szCs w:val="21"/>
+        </w:rPr>
+        <w:t xml:space="preserve">"“…” is locked by your organisation's app protection …"</w:t>
+      </w:r>
+      <w:r>
+        <w:rPr>
+          <w:rFonts w:ascii="Calibri" w:cs="Calibri" w:eastAsia="Calibri" w:hAnsi="Calibri"/>
+          <w:color w:val="262E33"/>
+          <w:sz w:val="21"/>
+          <w:szCs w:val="21"/>
+        </w:rPr>
+        <w:t xml:space="preserve">. Save the same attachment from Outlook on the PC and drop that copy instead.</w:t>
+      </w:r>
+    </w:p>
+    <w:p>
+      <w:pPr>
         <w:pStyle w:val="Heading2"/>
         <w:keepNext/>
         <w:spacing w:after="90" w:before="280"/>
@@ -4746,6 +4791,89 @@
     </w:p>
     <w:p>
       <w:pPr>
+        <w:spacing w:after="140" w:line="276" w:lineRule="auto"/>
+      </w:pPr>
+      <w:r>
+        <w:rPr>
+          <w:rFonts w:ascii="Calibri" w:cs="Calibri" w:eastAsia="Calibri" w:hAnsi="Calibri"/>
+          <w:b/>
+          <w:bCs/>
+          <w:color w:val="262E33"/>
+          <w:sz w:val="21"/>
+          <w:szCs w:val="21"/>
+        </w:rPr>
+        <w:t xml:space="preserve">A unit put away in a platform.</w:t>
+      </w:r>
+      <w:r>
+        <w:rPr>
+          <w:rFonts w:ascii="Calibri" w:cs="Calibri" w:eastAsia="Calibri" w:hAnsi="Calibri"/>
+          <w:color w:val="262E33"/>
+          <w:sz w:val="21"/>
+          <w:szCs w:val="21"/>
+        </w:rPr>
+        <w:t xml:space="preserve"> The prints mark a unit being put away with a </w:t>
+      </w:r>
+      <w:r>
+        <w:rPr>
+          <w:rFonts w:ascii="Consolas" w:cs="Consolas" w:eastAsia="Consolas" w:hAnsi="Consolas"/>
+          <w:color w:val="262E33"/>
+          <w:sz w:val="19"/>
+          <w:szCs w:val="19"/>
+        </w:rPr>
+        <w:t xml:space="preserve">#</w:t>
+      </w:r>
+      <w:r>
+        <w:rPr>
+          <w:rFonts w:ascii="Calibri" w:cs="Calibri" w:eastAsia="Calibri" w:hAnsi="Calibri"/>
+          <w:color w:val="262E33"/>
+          <w:sz w:val="21"/>
+          <w:szCs w:val="21"/>
+        </w:rPr>
+        <w:t xml:space="preserve">. That is usually in a siding, but on an engineering-works weekend a unit can be stabled in a platform — at Victoria or Hastings, say. That unit's departure out of the platform gets a line of its own. Every other train calling there is still a turnround, and is not listed. The Review tab names each one under </w:t>
+      </w:r>
+      <w:r>
+        <w:rPr>
+          <w:rFonts w:ascii="Calibri" w:cs="Calibri" w:eastAsia="Calibri" w:hAnsi="Calibri"/>
+          <w:i/>
+          <w:iCs/>
+          <w:color w:val="262E33"/>
+          <w:sz w:val="21"/>
+          <w:szCs w:val="21"/>
+        </w:rPr>
+        <w:t xml:space="preserve">Notes</w:t>
+      </w:r>
+      <w:r>
+        <w:rPr>
+          <w:rFonts w:ascii="Calibri" w:cs="Calibri" w:eastAsia="Calibri" w:hAnsi="Calibri"/>
+          <w:color w:val="262E33"/>
+          <w:sz w:val="21"/>
+          <w:szCs w:val="21"/>
+        </w:rPr>
+        <w:t xml:space="preserve">: </w:t>
+      </w:r>
+      <w:r>
+        <w:rPr>
+          <w:rFonts w:ascii="Calibri" w:cs="Calibri" w:eastAsia="Calibri" w:hAnsi="Calibri"/>
+          <w:i/>
+          <w:iCs/>
+          <w:color w:val="262E33"/>
+          <w:sz w:val="21"/>
+          <w:szCs w:val="21"/>
+        </w:rPr>
+        <w:t xml:space="preserve">"Vic (E): shunted (#) on 2 diagrams (…), but trains leave it in passenger service, so only those stops are treated as a berth there — not every call at it."</w:t>
+      </w:r>
+      <w:r>
+        <w:rPr>
+          <w:rFonts w:ascii="Calibri" w:cs="Calibri" w:eastAsia="Calibri" w:hAnsi="Calibri"/>
+          <w:color w:val="262E33"/>
+          <w:sz w:val="21"/>
+          <w:szCs w:val="21"/>
+        </w:rPr>
+        <w:t xml:space="preserve"> An older copy of the page treated the whole station as a siding for the day, so every departure from it was listed and nearly every unit read VIC in both columns — the 10/11 October sheets. If you see that, you have an old copy: use this one.</w:t>
+      </w:r>
+    </w:p>
+    <w:p>
+      <w:pPr>
         <w:pStyle w:val="Heading2"/>
         <w:keepNext/>
         <w:spacing w:after="90" w:before="280"/>
@@ -5470,7 +5598,7 @@
           <w:sz w:val="21"/>
           <w:szCs w:val="21"/>
         </w:rPr>
-        <w:t xml:space="preserve">Cannon Street rounders are listed on their first departure here too, the same as on the weekend.</w:t>
+        <w:t xml:space="preserve">Cannon Street rounders are listed on their first departure here too, and a unit put away in a platform gets a line of its own without the rest of the station following it, the same as on the weekend.</w:t>
       </w:r>
     </w:p>
     <w:p>
@@ -9731,7 +9859,25 @@
           <w:sz w:val="21"/>
           <w:szCs w:val="21"/>
         </w:rPr>
-        <w:t xml:space="preserve"> — everything else: a diagram in one report but not the other, a Summary exported without the Genius setting, a date left out.</w:t>
+        <w:t xml:space="preserve"> — everything else: a diagram in one report but not the other, a Summary exported without the Genius setting, a date left out, a unit put away (</w:t>
+      </w:r>
+      <w:r>
+        <w:rPr>
+          <w:rFonts w:ascii="Consolas" w:cs="Consolas" w:eastAsia="Consolas" w:hAnsi="Consolas"/>
+          <w:color w:val="262E33"/>
+          <w:sz w:val="19"/>
+          <w:szCs w:val="19"/>
+        </w:rPr>
+        <w:t xml:space="preserve">#</w:t>
+      </w:r>
+      <w:r>
+        <w:rPr>
+          <w:rFonts w:ascii="Calibri" w:cs="Calibri" w:eastAsia="Calibri" w:hAnsi="Calibri"/>
+          <w:color w:val="262E33"/>
+          <w:sz w:val="21"/>
+          <w:szCs w:val="21"/>
+        </w:rPr>
+        <w:t xml:space="preserve">) in a station platform in the weekend prints.</w:t>
       </w:r>
     </w:p>
     <w:p>
@@ -13778,7 +13924,7 @@
                 <w:sz w:val="21"/>
                 <w:szCs w:val="21"/>
               </w:rPr>
-              <w:t xml:space="preserve"> (any tab)</w:t>
+              <w:t xml:space="preserve"> (any tab, and the Diagram Analyser)</w:t>
             </w:r>
           </w:p>
         </w:tc>
@@ -13855,7 +14001,7 @@
                 <w:sz w:val="21"/>
                 <w:szCs w:val="21"/>
               </w:rPr>
-              <w:t xml:space="preserve">Fixed in 3.34.2. A single </w:t>
+              <w:t xml:space="preserve">An old copy of the page, before 3.34.2. A single </w:t>
             </w:r>
             <w:r>
               <w:rPr>
@@ -13873,7 +14019,7 @@
                 <w:sz w:val="21"/>
                 <w:szCs w:val="21"/>
               </w:rPr>
-              <w:t xml:space="preserve"> (unit put away) on a platform in the prints made that station a siding for every diagram. The Review tab now says </w:t>
+              <w:t xml:space="preserve"> (unit put away) in a platform in the prints made that station a siding for every diagram. Use this copy: the unit put away there gets its own line, and the Review tab says </w:t>
             </w:r>
             <w:r>
               <w:rPr>
@@ -13893,7 +14039,7 @@
                 <w:sz w:val="21"/>
                 <w:szCs w:val="21"/>
               </w:rPr>
-              <w:t xml:space="preserve"> when it meets one.</w:t>
+              <w:t xml:space="preserve">.</w:t>
             </w:r>
           </w:p>
         </w:tc>

</xml_diff>

<commit_message>
Docs: README and user guide for 3.34.x
README: the rulebook summary names the turnround sidings (MINOR_SPUR,
MINOR_SPUR_NAMES, BERTH_STAY) with SG829 at Plumstead, the Grove Park depot
shunt, and the weekend '#' in a platform; the AM/PM bullet explains the
putAway exception (RM021/022 off Faversham); the module, data-table and
regression-test rows are brought up to date. User guide: the "wrong way
round" and "train seems to be missing" rows say what the tool now settles
or leaves off on purpose.

Co-Authored-By: Claude Opus 5.5 <noreply@anthropic.com>
Claude-Session: https://claude.ai/code/session_01Bo8y3CPA6i1JGS4N3h4DXr
</commit_message>
<xml_diff>
--- a/HOW TO USE.docx
+++ b/HOW TO USE.docx
@@ -13619,7 +13619,7 @@
                 <w:sz w:val="21"/>
                 <w:szCs w:val="21"/>
               </w:rPr>
-              <w:t xml:space="preserve">Look for the note above first. Otherwise, if the entry is under </w:t>
+              <w:t xml:space="preserve">Look for the note above first. Otherwise look under </w:t>
             </w:r>
             <w:r>
               <w:rPr>
@@ -13639,7 +13639,27 @@
                 <w:sz w:val="21"/>
                 <w:szCs w:val="21"/>
               </w:rPr>
-              <w:t xml:space="preserve">, the reports could not settle it; if it is not, the order came from the tables. Either way, press </w:t>
+              <w:t xml:space="preserve">: either the reports could not settle it, or the note says one unit's Position was left over from earlier in the day and how the tool settled it (</w:t>
+            </w:r>
+            <w:r>
+              <w:rPr>
+                <w:rFonts w:ascii="Calibri" w:cs="Calibri" w:eastAsia="Calibri" w:hAnsi="Calibri"/>
+                <w:i/>
+                <w:iCs/>
+                <w:color w:val="262E33"/>
+                <w:sz w:val="21"/>
+                <w:szCs w:val="21"/>
+              </w:rPr>
+              <w:t xml:space="preserve">"… so 917 is taken as Position 2"</w:t>
+            </w:r>
+            <w:r>
+              <w:rPr>
+                <w:rFonts w:ascii="Calibri" w:cs="Calibri" w:eastAsia="Calibri" w:hAnsi="Calibri"/>
+                <w:color w:val="262E33"/>
+                <w:sz w:val="21"/>
+                <w:szCs w:val="21"/>
+              </w:rPr>
+              <w:t xml:space="preserve">). If the entry is not there, the order came from the tables. Either way, press </w:t>
             </w:r>
             <w:r>
               <w:rPr>
@@ -13803,7 +13823,7 @@
                 <w:sz w:val="21"/>
                 <w:szCs w:val="21"/>
               </w:rPr>
-              <w:t xml:space="preserve"> first. If it is not there, note the diagram number and report it.</w:t>
+              <w:t xml:space="preserve"> first. A unit that only turns round for under 65 minutes in the Plumstead, Bellingham, Gillingham Up, Hastings Park, St Leonards CET or Sevenoaks sidings — SG829 on its 5Z82, say — has no line there on purpose: it was not put away. Otherwise, note the diagram number and report it.</w:t>
             </w:r>
           </w:p>
         </w:tc>

</xml_diff>

<commit_message>
Books: a berth reached in the evening is the PM column's
RM013 on 26/10 is put away in Ramsgate depot at 22:17, goes out to Herne
Bay and back after midnight and finishes there at 03:05. Its Dover Priory
06 45 row read RE in the AM column: the night-berth rule only fired when the
unit ended the day somewhere else. It now fires whenever the unit moves on.

Its 01+08 row read RE in the AM column too, because 03:05 is just past the
03:00 start of day and the AM/PM tests read times off the clock face. They
now use the time as the readers rolled it (dayT), so a day ending at 27:05
ends in the night. On 26/10 that also puts GT129's 16 25 back to the row
the depot confirmed in 3.1.2; on 21/10 SG403/404's Slade Green 15+33 row
loses VIC from the AM column. Nothing else changes on either day.

Co-Authored-By: Claude Opus 5.5 <noreply@anthropic.com>
Claude-Session: https://claude.ai/code/session_01Bo8y3CPA6i1JGS4N3h4DXr
</commit_message>
<xml_diff>
--- a/HOW TO USE.docx
+++ b/HOW TO USE.docx
@@ -8087,7 +8087,7 @@
                 <w:sz w:val="21"/>
                 <w:szCs w:val="21"/>
               </w:rPr>
-              <w:t xml:space="preserve"> — where it finishes the day</w:t>
+              <w:t xml:space="preserve"> — where it finishes the day, including a berth it only reaches in the evening</w:t>
             </w:r>
           </w:p>
         </w:tc>
@@ -8439,6 +8439,31 @@
           <w:szCs w:val="21"/>
         </w:rPr>
         <w:t xml:space="preserve">. The usual house convention. Mainline and Ramsgate are timed off the departure — the moment the unit leaves the area — except at Grove Park and Slade Green, where it is the moment the unit first moves off the berth.</w:t>
+      </w:r>
+    </w:p>
+    <w:p>
+      <w:pPr>
+        <w:spacing w:after="140" w:line="276" w:lineRule="auto"/>
+      </w:pPr>
+      <w:r>
+        <w:rPr>
+          <w:rFonts w:ascii="Calibri" w:cs="Calibri" w:eastAsia="Calibri" w:hAnsi="Calibri"/>
+          <w:b/>
+          <w:bCs/>
+          <w:color w:val="262E33"/>
+          <w:sz w:val="21"/>
+          <w:szCs w:val="21"/>
+        </w:rPr>
+        <w:t xml:space="preserve">AM or PM.</w:t>
+      </w:r>
+      <w:r>
+        <w:rPr>
+          <w:rFonts w:ascii="Calibri" w:cs="Calibri" w:eastAsia="Calibri" w:hAnsi="Calibri"/>
+          <w:color w:val="262E33"/>
+          <w:sz w:val="21"/>
+          <w:szCs w:val="21"/>
+        </w:rPr>
+        <w:t xml:space="preserve"> Column D is only for somewhere the unit stands during the day. Somewhere it is put away in the evening is the PM column's, even when it goes out again late and comes back to the same place. RM013 is put away at Ramsgate depot at 22 17, runs to Herne Bay and back after midnight and finishes there at 03 05: its rows read RE in E, not D. A day's work that runs on past 03:00 the next morning still ends in the night, so it reads PM.</w:t>
       </w:r>
     </w:p>
     <w:p>

</xml_diff>